<commit_message>
Phase 3: Quick Check quizzes + attribution rendering
Quiz generation (structured outputs, per-lesson validation, seeded shuffle,
batch/checkpoint), validator, validator-gated renderer (pptx/html/docx, PDFs
via generate_pdfs.js). Attribution from config/attribution.yaml in all docx,
lesson footers, decks and answer keys. 5 sample lessons generated.

Co-Authored-By: Claude Opus 5.5 (1M context) <noreply@anthropic.com>
</commit_message>
<xml_diff>
--- a/data/outputs/v2/Biology/SS2.1_Plant_Nutrition/Biology_Plant_Nutrition_CBE_LessonSequence.docx
+++ b/data/outputs/v2/Biology/SS2.1_Plant_Nutrition/Biology_Plant_Nutrition_CBE_LessonSequence.docx
@@ -42,6 +42,177 @@
     </w:p>
     <w:p>
       <w:pPr>
+        <w:spacing w:after="80" w:before="120"/>
+      </w:pPr>
+      <w:r>
+        <w:rPr>
+          <w:rFonts w:ascii="Arial" w:cs="Arial" w:eastAsia="Arial" w:hAnsi="Arial"/>
+          <w:b/>
+          <w:bCs/>
+          <w:color w:val="1F3864"/>
+          <w:sz w:val="20"/>
+          <w:szCs w:val="20"/>
+        </w:rPr>
+        <w:t xml:space="preserve">ATTRIBUTION AND LICENSING</w:t>
+      </w:r>
+    </w:p>
+    <w:p>
+      <w:pPr>
+        <w:spacing w:after="60" w:before="0"/>
+      </w:pPr>
+      <w:r>
+        <w:rPr>
+          <w:rFonts w:ascii="Arial" w:cs="Arial" w:eastAsia="Arial" w:hAnsi="Arial"/>
+          <w:b/>
+          <w:bCs/>
+          <w:sz w:val="17"/>
+          <w:szCs w:val="17"/>
+        </w:rPr>
+        <w:t xml:space="preserve">Curriculum Alignment: </w:t>
+      </w:r>
+      <w:r>
+        <w:rPr>
+          <w:rFonts w:ascii="Arial" w:cs="Arial" w:eastAsia="Arial" w:hAnsi="Arial"/>
+          <w:sz w:val="17"/>
+          <w:szCs w:val="17"/>
+        </w:rPr>
+        <w:t xml:space="preserve">Structured in pedagogical alignment with the competence-based curriculum format and learning outcomes established by the Kenya Institute of Curriculum Development (KICD). This material is independently developed and is not officially endorsed or published by KICD.</w:t>
+      </w:r>
+    </w:p>
+    <w:p>
+      <w:pPr>
+        <w:spacing w:after="60" w:before="0"/>
+      </w:pPr>
+      <w:r>
+        <w:rPr>
+          <w:rFonts w:ascii="Arial" w:cs="Arial" w:eastAsia="Arial" w:hAnsi="Arial"/>
+          <w:b/>
+          <w:bCs/>
+          <w:sz w:val="17"/>
+          <w:szCs w:val="17"/>
+        </w:rPr>
+        <w:t xml:space="preserve">Content &amp; Pedagogy: </w:t>
+      </w:r>
+      <w:r>
+        <w:rPr>
+          <w:rFonts w:ascii="Arial" w:cs="Arial" w:eastAsia="Arial" w:hAnsi="Arial"/>
+          <w:sz w:val="17"/>
+          <w:szCs w:val="17"/>
+        </w:rPr>
+        <w:t xml:space="preserve">Developed and adapted by the educator team at SeaVuria (registered 501(c)(3) in the United States and registered NGO in Kenya, No. 872-850A-BF11), who designed the pedagogical framework, lesson templates and exemplar lessons on which this material is based.</w:t>
+      </w:r>
+    </w:p>
+    <w:p>
+      <w:pPr>
+        <w:spacing w:after="60" w:before="0"/>
+      </w:pPr>
+      <w:r>
+        <w:rPr>
+          <w:rFonts w:ascii="Arial" w:cs="Arial" w:eastAsia="Arial" w:hAnsi="Arial"/>
+          <w:b/>
+          <w:bCs/>
+          <w:sz w:val="17"/>
+          <w:szCs w:val="17"/>
+        </w:rPr>
+        <w:t xml:space="preserve">Production &amp; Layout: </w:t>
+      </w:r>
+      <w:r>
+        <w:rPr>
+          <w:rFonts w:ascii="Arial" w:cs="Arial" w:eastAsia="Arial" w:hAnsi="Arial"/>
+          <w:sz w:val="17"/>
+          <w:szCs w:val="17"/>
+        </w:rPr>
+        <w:t xml:space="preserve">Educational design and curriculum sequencing by SeaVuria. Technical layout, structural formatting, and digital optimization/implementation executed in partnership with ARES Education (registered 501(c)(3) in the United States and Canada (as Afretech Aid) and registered NGO in Kenya), with lesson drafting and compilation assisted by AI (Claude, Anthropic).</w:t>
+      </w:r>
+    </w:p>
+    <w:p>
+      <w:pPr>
+        <w:pBdr>
+          <w:bottom w:val="single" w:color="1F3864" w:sz="6" w:space="6"/>
+        </w:pBdr>
+        <w:spacing w:after="60" w:before="0"/>
+      </w:pPr>
+      <w:r>
+        <w:rPr>
+          <w:rFonts w:ascii="Arial" w:cs="Arial" w:eastAsia="Arial" w:hAnsi="Arial"/>
+          <w:b/>
+          <w:bCs/>
+          <w:sz w:val="17"/>
+          <w:szCs w:val="17"/>
+        </w:rPr>
+        <w:t xml:space="preserve">Licensing &amp; Copyright: </w:t>
+      </w:r>
+      <w:r>
+        <w:rPr>
+          <w:rFonts w:ascii="Arial" w:cs="Arial" w:eastAsia="Arial" w:hAnsi="Arial"/>
+          <w:sz w:val="17"/>
+          <w:szCs w:val="17"/>
+        </w:rPr>
+        <w:t xml:space="preserve">© 2026 SeaVuria and ARES. This work is licensed under a </w:t>
+      </w:r>
+      <w:hyperlink w:history="1" r:id="rId91gvk8jt3hdrphs2xkfra">
+        <w:r>
+          <w:rPr>
+            <w:rFonts w:ascii="Arial" w:cs="Arial" w:eastAsia="Arial" w:hAnsi="Arial"/>
+            <w:color w:val="1F6B75"/>
+            <w:sz w:val="17"/>
+            <w:szCs w:val="17"/>
+            <w:u w:val="single" w:color="1F6B75"/>
+          </w:rPr>
+          <w:t xml:space="preserve">Creative Commons Attribution-NonCommercial 4.0 International License</w:t>
+        </w:r>
+      </w:hyperlink>
+      <w:r>
+        <w:rPr>
+          <w:rFonts w:ascii="Arial" w:cs="Arial" w:eastAsia="Arial" w:hAnsi="Arial"/>
+          <w:sz w:val="17"/>
+          <w:szCs w:val="17"/>
+        </w:rPr>
+        <w:t xml:space="preserve"> (</w:t>
+      </w:r>
+      <w:hyperlink w:history="1" r:id="rIdpvupnlktu5gdvukldqqzq">
+        <w:r>
+          <w:rPr>
+            <w:rFonts w:ascii="Arial" w:cs="Arial" w:eastAsia="Arial" w:hAnsi="Arial"/>
+            <w:color w:val="1F6B75"/>
+            <w:sz w:val="17"/>
+            <w:szCs w:val="17"/>
+            <w:u w:val="single" w:color="1F6B75"/>
+          </w:rPr>
+          <w:t xml:space="preserve">CC BY-NC 4.0</w:t>
+        </w:r>
+      </w:hyperlink>
+      <w:r>
+        <w:rPr>
+          <w:rFonts w:ascii="Arial" w:cs="Arial" w:eastAsia="Arial" w:hAnsi="Arial"/>
+          <w:sz w:val="17"/>
+          <w:szCs w:val="17"/>
+        </w:rPr>
+        <w:t xml:space="preserve">). To view a copy of this license, visit </w:t>
+      </w:r>
+      <w:hyperlink w:history="1" r:id="rIdto3g-q2rylxlncr5w0sp2">
+        <w:r>
+          <w:rPr>
+            <w:rFonts w:ascii="Arial" w:cs="Arial" w:eastAsia="Arial" w:hAnsi="Arial"/>
+            <w:color w:val="1F6B75"/>
+            <w:sz w:val="17"/>
+            <w:szCs w:val="17"/>
+            <w:u w:val="single" w:color="1F6B75"/>
+          </w:rPr>
+          <w:t xml:space="preserve">https://creativecommons.org/licenses/by-nc/4.0/</w:t>
+        </w:r>
+      </w:hyperlink>
+      <w:r>
+        <w:rPr>
+          <w:rFonts w:ascii="Arial" w:cs="Arial" w:eastAsia="Arial" w:hAnsi="Arial"/>
+          <w:sz w:val="17"/>
+          <w:szCs w:val="17"/>
+        </w:rPr>
+        <w:t xml:space="preserve">. You are free to copy, redistribute, and adapt this material in any medium or format, provided appropriate credit is given and the material is not used for commercial purposes. KICD learning outcomes and curriculum designations reproduced here for alignment purposes remain the property of KICD and are not covered by this license. Linked external resources (e.g. CK-12, Khan Academy, PhET) are subject to their own licenses.</w:t>
+      </w:r>
+    </w:p>
+    <w:p>
+      <w:pPr>
         <w:spacing w:after="120"/>
       </w:pPr>
       <w:r>
@@ -3457,7 +3628,7 @@
               <w:spacing w:after="10" w:before="0"/>
               <w:ind w:left="120"/>
             </w:pPr>
-            <w:hyperlink w:history="1" r:id="rIdej4ck0sfcrtgg6vl3qoqs">
+            <w:hyperlink w:history="1" r:id="rId9zbduf-ep2awt8bpeg730">
               <w:r>
                 <w:rPr>
                   <w:rFonts w:ascii="Arial" w:cs="Arial" w:eastAsia="Arial" w:hAnsi="Arial"/>
@@ -3534,7 +3705,7 @@
               <w:spacing w:after="10" w:before="0"/>
               <w:ind w:left="120"/>
             </w:pPr>
-            <w:hyperlink w:history="1" r:id="rIdzzulnc8uw3dvt6fr_dqvy">
+            <w:hyperlink w:history="1" r:id="rIdwg7cjjkpcibjjy8urjrxa">
               <w:r>
                 <w:rPr>
                   <w:rFonts w:ascii="Arial" w:cs="Arial" w:eastAsia="Arial" w:hAnsi="Arial"/>
@@ -3761,7 +3932,7 @@
               <w:spacing w:after="10" w:before="0"/>
               <w:ind w:left="120"/>
             </w:pPr>
-            <w:hyperlink w:history="1" r:id="rIdkbjfvliyajyuangtscy11">
+            <w:hyperlink w:history="1" r:id="rIdwmd1yw0fbve_ho49p3zo_">
               <w:r>
                 <w:rPr>
                   <w:rFonts w:ascii="Arial" w:cs="Arial" w:eastAsia="Arial" w:hAnsi="Arial"/>
@@ -3838,7 +4009,7 @@
               <w:spacing w:after="10" w:before="0"/>
               <w:ind w:left="120"/>
             </w:pPr>
-            <w:hyperlink w:history="1" r:id="rIduff-d_h5tesnfinwblppk">
+            <w:hyperlink w:history="1" r:id="rIdoug2_sj5oly1opht661bn">
               <w:r>
                 <w:rPr>
                   <w:rFonts w:ascii="Arial" w:cs="Arial" w:eastAsia="Arial" w:hAnsi="Arial"/>
@@ -4065,7 +4236,7 @@
               <w:spacing w:after="10" w:before="0"/>
               <w:ind w:left="120"/>
             </w:pPr>
-            <w:hyperlink w:history="1" r:id="rIdqg4a_htcfg502sfc677bb">
+            <w:hyperlink w:history="1" r:id="rIdysv5rssmcwvv9qiz4uvjr">
               <w:r>
                 <w:rPr>
                   <w:rFonts w:ascii="Arial" w:cs="Arial" w:eastAsia="Arial" w:hAnsi="Arial"/>
@@ -4142,7 +4313,7 @@
               <w:spacing w:after="10" w:before="0"/>
               <w:ind w:left="120"/>
             </w:pPr>
-            <w:hyperlink w:history="1" r:id="rIdytx0563tgbe2em1fbnmuq">
+            <w:hyperlink w:history="1" r:id="rIdefgnxjqy72vf8ub2mimis">
               <w:r>
                 <w:rPr>
                   <w:rFonts w:ascii="Arial" w:cs="Arial" w:eastAsia="Arial" w:hAnsi="Arial"/>
@@ -4369,7 +4540,7 @@
               <w:spacing w:after="10" w:before="0"/>
               <w:ind w:left="120"/>
             </w:pPr>
-            <w:hyperlink w:history="1" r:id="rIdtctijilpfvylt70auc3zr">
+            <w:hyperlink w:history="1" r:id="rIdrcdfi-pzwuaxexn0va0ap">
               <w:r>
                 <w:rPr>
                   <w:rFonts w:ascii="Arial" w:cs="Arial" w:eastAsia="Arial" w:hAnsi="Arial"/>
@@ -4446,7 +4617,7 @@
               <w:spacing w:after="10" w:before="0"/>
               <w:ind w:left="120"/>
             </w:pPr>
-            <w:hyperlink w:history="1" r:id="rIdhknxhagkmshky-juutphi">
+            <w:hyperlink w:history="1" r:id="rIdokerm5axm9jn60pdlvzn-">
               <w:r>
                 <w:rPr>
                   <w:rFonts w:ascii="Arial" w:cs="Arial" w:eastAsia="Arial" w:hAnsi="Arial"/>
@@ -4673,7 +4844,7 @@
               <w:spacing w:after="10" w:before="0"/>
               <w:ind w:left="120"/>
             </w:pPr>
-            <w:hyperlink w:history="1" r:id="rId2h1if5uzwwgmkfahokcra">
+            <w:hyperlink w:history="1" r:id="rIds4hxaqvghs8f_doy2_3a5">
               <w:r>
                 <w:rPr>
                   <w:rFonts w:ascii="Arial" w:cs="Arial" w:eastAsia="Arial" w:hAnsi="Arial"/>
@@ -4750,7 +4921,7 @@
               <w:spacing w:after="10" w:before="0"/>
               <w:ind w:left="120"/>
             </w:pPr>
-            <w:hyperlink w:history="1" r:id="rIdze3o8hflzf4jy3gow7urh">
+            <w:hyperlink w:history="1" r:id="rIdxbzmfrgqoglywphnftahy">
               <w:r>
                 <w:rPr>
                   <w:rFonts w:ascii="Arial" w:cs="Arial" w:eastAsia="Arial" w:hAnsi="Arial"/>
@@ -5261,6 +5432,65 @@
         </w:tc>
       </w:tr>
     </w:tbl>
+    <w:p>
+      <w:pPr>
+        <w:pBdr>
+          <w:top w:val="single" w:color="BBBBBB" w:sz="4" w:space="4"/>
+        </w:pBdr>
+        <w:spacing w:after="0" w:before="160"/>
+      </w:pPr>
+      <w:r>
+        <w:rPr>
+          <w:rFonts w:ascii="Arial" w:cs="Arial" w:eastAsia="Arial" w:hAnsi="Arial"/>
+          <w:color w:val="666666"/>
+          <w:sz w:val="14"/>
+          <w:szCs w:val="14"/>
+        </w:rPr>
+        <w:t xml:space="preserve">© 2026 SeaVuria and ARES. Aligned with KICD objectives. Developed by SeaVuria; technical implementation by ARES (with AI assistance from Claude). Licensed under </w:t>
+      </w:r>
+      <w:hyperlink w:history="1" r:id="rIdtbs8sejaywula8ut8hnei">
+        <w:r>
+          <w:rPr>
+            <w:rFonts w:ascii="Arial" w:cs="Arial" w:eastAsia="Arial" w:hAnsi="Arial"/>
+            <w:color w:val="1F6B75"/>
+            <w:sz w:val="14"/>
+            <w:szCs w:val="14"/>
+            <w:u w:val="single" w:color="1F6B75"/>
+          </w:rPr>
+          <w:t xml:space="preserve">CC BY-NC 4.0</w:t>
+        </w:r>
+      </w:hyperlink>
+      <w:r>
+        <w:rPr>
+          <w:rFonts w:ascii="Arial" w:cs="Arial" w:eastAsia="Arial" w:hAnsi="Arial"/>
+          <w:color w:val="666666"/>
+          <w:sz w:val="14"/>
+          <w:szCs w:val="14"/>
+        </w:rPr>
+        <w:t xml:space="preserve"> (</w:t>
+      </w:r>
+      <w:hyperlink w:history="1" r:id="rIdr8xkjbufxgshygktv_eng">
+        <w:r>
+          <w:rPr>
+            <w:rFonts w:ascii="Arial" w:cs="Arial" w:eastAsia="Arial" w:hAnsi="Arial"/>
+            <w:color w:val="1F6B75"/>
+            <w:sz w:val="14"/>
+            <w:szCs w:val="14"/>
+            <w:u w:val="single" w:color="1F6B75"/>
+          </w:rPr>
+          <w:t xml:space="preserve">https://creativecommons.org/licenses/by-nc/4.0/</w:t>
+        </w:r>
+      </w:hyperlink>
+      <w:r>
+        <w:rPr>
+          <w:rFonts w:ascii="Arial" w:cs="Arial" w:eastAsia="Arial" w:hAnsi="Arial"/>
+          <w:color w:val="666666"/>
+          <w:sz w:val="14"/>
+          <w:szCs w:val="14"/>
+        </w:rPr>
+        <w:t xml:space="preserve">).</w:t>
+      </w:r>
+    </w:p>
     <w:p>
       <w:r>
         <w:br w:type="page"/>
@@ -6252,7 +6482,7 @@
             <w:pPr>
               <w:spacing w:after="20" w:before="0"/>
             </w:pPr>
-            <w:hyperlink w:history="1" r:id="rIdzvoikpefh4ntjbxubxld4">
+            <w:hyperlink w:history="1" r:id="rIdaswc1tghqksp95icungc-">
               <w:r>
                 <w:rPr>
                   <w:rFonts w:ascii="Arial" w:cs="Arial" w:eastAsia="Arial" w:hAnsi="Arial"/>
@@ -6285,7 +6515,7 @@
               <w:spacing w:after="10" w:before="0"/>
               <w:ind w:left="120"/>
             </w:pPr>
-            <w:hyperlink w:history="1" r:id="rIdq7yftxaguupu035x1hbo0">
+            <w:hyperlink w:history="1" r:id="rIdqos1aezl-x1wdrme1inbm">
               <w:r>
                 <w:rPr>
                   <w:rFonts w:ascii="Arial" w:cs="Arial" w:eastAsia="Arial" w:hAnsi="Arial"/>
@@ -6330,7 +6560,7 @@
             <w:pPr>
               <w:spacing w:after="20" w:before="0"/>
             </w:pPr>
-            <w:hyperlink w:history="1" r:id="rIdpolnbn3sa8njymfhqec1p">
+            <w:hyperlink w:history="1" r:id="rId4omua9glcll33bbpbkq4i">
               <w:r>
                 <w:rPr>
                   <w:rFonts w:ascii="Arial" w:cs="Arial" w:eastAsia="Arial" w:hAnsi="Arial"/>
@@ -6363,7 +6593,7 @@
               <w:spacing w:after="10" w:before="0"/>
               <w:ind w:left="120"/>
             </w:pPr>
-            <w:hyperlink w:history="1" r:id="rId3yaoffc_chbbec1yemews">
+            <w:hyperlink w:history="1" r:id="rId1c8gqf4f5duhs5dc7cc_j">
               <w:r>
                 <w:rPr>
                   <w:rFonts w:ascii="Arial" w:cs="Arial" w:eastAsia="Arial" w:hAnsi="Arial"/>
@@ -6558,7 +6788,7 @@
             <w:pPr>
               <w:spacing w:after="20" w:before="0"/>
             </w:pPr>
-            <w:hyperlink w:history="1" r:id="rIdznhfnodhao-mxkhyhqz8d">
+            <w:hyperlink w:history="1" r:id="rIdhv25vfwn1fz5-7qbyikfc">
               <w:r>
                 <w:rPr>
                   <w:rFonts w:ascii="Arial" w:cs="Arial" w:eastAsia="Arial" w:hAnsi="Arial"/>
@@ -6591,7 +6821,7 @@
               <w:spacing w:after="10" w:before="0"/>
               <w:ind w:left="120"/>
             </w:pPr>
-            <w:hyperlink w:history="1" r:id="rIdhzlojdx0bkulqznxmyyn_">
+            <w:hyperlink w:history="1" r:id="rIduzzb9cxmh95o-8ybdinzd">
               <w:r>
                 <w:rPr>
                   <w:rFonts w:ascii="Arial" w:cs="Arial" w:eastAsia="Arial" w:hAnsi="Arial"/>
@@ -6636,7 +6866,7 @@
             <w:pPr>
               <w:spacing w:after="20" w:before="0"/>
             </w:pPr>
-            <w:hyperlink w:history="1" r:id="rIdcko4z_pgyqrfpzddwmzbe">
+            <w:hyperlink w:history="1" r:id="rId5mecr0zrn4enxvstu2vuj">
               <w:r>
                 <w:rPr>
                   <w:rFonts w:ascii="Arial" w:cs="Arial" w:eastAsia="Arial" w:hAnsi="Arial"/>
@@ -6669,7 +6899,7 @@
               <w:spacing w:after="10" w:before="0"/>
               <w:ind w:left="120"/>
             </w:pPr>
-            <w:hyperlink w:history="1" r:id="rIdspicalqqqddlmqtefve-q">
+            <w:hyperlink w:history="1" r:id="rIdaydmetws11ekt5xjninsl">
               <w:r>
                 <w:rPr>
                   <w:rFonts w:ascii="Arial" w:cs="Arial" w:eastAsia="Arial" w:hAnsi="Arial"/>
@@ -6864,7 +7094,7 @@
             <w:pPr>
               <w:spacing w:after="20" w:before="0"/>
             </w:pPr>
-            <w:hyperlink w:history="1" r:id="rIdkt2akvlffzcxscuytf73o">
+            <w:hyperlink w:history="1" r:id="rId3zfo8efkux1yjtcgtndpe">
               <w:r>
                 <w:rPr>
                   <w:rFonts w:ascii="Arial" w:cs="Arial" w:eastAsia="Arial" w:hAnsi="Arial"/>
@@ -6897,7 +7127,7 @@
               <w:spacing w:after="10" w:before="0"/>
               <w:ind w:left="120"/>
             </w:pPr>
-            <w:hyperlink w:history="1" r:id="rIdcfmj4xzivxqwzmv6cowak">
+            <w:hyperlink w:history="1" r:id="rIdwvttzde5zr3jit8_exnui">
               <w:r>
                 <w:rPr>
                   <w:rFonts w:ascii="Arial" w:cs="Arial" w:eastAsia="Arial" w:hAnsi="Arial"/>
@@ -6942,7 +7172,7 @@
             <w:pPr>
               <w:spacing w:after="20" w:before="0"/>
             </w:pPr>
-            <w:hyperlink w:history="1" r:id="rIdvahnho_cw33sue9viylnb">
+            <w:hyperlink w:history="1" r:id="rIdyl1hq8pxojsk5zj3laidl">
               <w:r>
                 <w:rPr>
                   <w:rFonts w:ascii="Arial" w:cs="Arial" w:eastAsia="Arial" w:hAnsi="Arial"/>
@@ -6975,7 +7205,7 @@
               <w:spacing w:after="10" w:before="0"/>
               <w:ind w:left="120"/>
             </w:pPr>
-            <w:hyperlink w:history="1" r:id="rIdkyc0k0mkivre8ahokysuu">
+            <w:hyperlink w:history="1" r:id="rId2sflyr_d34ntdbvutjdkn">
               <w:r>
                 <w:rPr>
                   <w:rFonts w:ascii="Arial" w:cs="Arial" w:eastAsia="Arial" w:hAnsi="Arial"/>
@@ -7170,7 +7400,7 @@
             <w:pPr>
               <w:spacing w:after="20" w:before="0"/>
             </w:pPr>
-            <w:hyperlink w:history="1" r:id="rIdoduu5nsdtqgfixtizpho-">
+            <w:hyperlink w:history="1" r:id="rId25wohrvtuguu2jmhd-997">
               <w:r>
                 <w:rPr>
                   <w:rFonts w:ascii="Arial" w:cs="Arial" w:eastAsia="Arial" w:hAnsi="Arial"/>
@@ -7203,7 +7433,7 @@
               <w:spacing w:after="10" w:before="0"/>
               <w:ind w:left="120"/>
             </w:pPr>
-            <w:hyperlink w:history="1" r:id="rIdsvvbkv7wz5tiodeafaial">
+            <w:hyperlink w:history="1" r:id="rIdsh40dlsbcupf8iastrcmz">
               <w:r>
                 <w:rPr>
                   <w:rFonts w:ascii="Arial" w:cs="Arial" w:eastAsia="Arial" w:hAnsi="Arial"/>
@@ -7248,7 +7478,7 @@
             <w:pPr>
               <w:spacing w:after="20" w:before="0"/>
             </w:pPr>
-            <w:hyperlink w:history="1" r:id="rIdrdxzscjx14iwo7lgect7r">
+            <w:hyperlink w:history="1" r:id="rIddgafxitg2udhl69lwczm_">
               <w:r>
                 <w:rPr>
                   <w:rFonts w:ascii="Arial" w:cs="Arial" w:eastAsia="Arial" w:hAnsi="Arial"/>
@@ -7281,7 +7511,7 @@
               <w:spacing w:after="10" w:before="0"/>
               <w:ind w:left="120"/>
             </w:pPr>
-            <w:hyperlink w:history="1" r:id="rIdar-fuyep5gml2e-hidhhq">
+            <w:hyperlink w:history="1" r:id="rIdmaktgzbv1qa9-donxf8ke">
               <w:r>
                 <w:rPr>
                   <w:rFonts w:ascii="Arial" w:cs="Arial" w:eastAsia="Arial" w:hAnsi="Arial"/>
@@ -7476,7 +7706,7 @@
             <w:pPr>
               <w:spacing w:after="20" w:before="0"/>
             </w:pPr>
-            <w:hyperlink w:history="1" r:id="rId8gtoseqkd3_gmohdsxfx6">
+            <w:hyperlink w:history="1" r:id="rIdlxysvguwrgpopss2pkdwk">
               <w:r>
                 <w:rPr>
                   <w:rFonts w:ascii="Arial" w:cs="Arial" w:eastAsia="Arial" w:hAnsi="Arial"/>
@@ -7509,7 +7739,7 @@
               <w:spacing w:after="10" w:before="0"/>
               <w:ind w:left="120"/>
             </w:pPr>
-            <w:hyperlink w:history="1" r:id="rIdy9pav09lazcbgvf2rt2qz">
+            <w:hyperlink w:history="1" r:id="rIdigqljxiluv3y3qxis9ppt">
               <w:r>
                 <w:rPr>
                   <w:rFonts w:ascii="Arial" w:cs="Arial" w:eastAsia="Arial" w:hAnsi="Arial"/>
@@ -7554,7 +7784,7 @@
             <w:pPr>
               <w:spacing w:after="20" w:before="0"/>
             </w:pPr>
-            <w:hyperlink w:history="1" r:id="rId0pya-ghq962oej6v7pqbf">
+            <w:hyperlink w:history="1" r:id="rIdtvto_yr62eqne2i1gaxa6">
               <w:r>
                 <w:rPr>
                   <w:rFonts w:ascii="Arial" w:cs="Arial" w:eastAsia="Arial" w:hAnsi="Arial"/>
@@ -7587,7 +7817,7 @@
               <w:spacing w:after="10" w:before="0"/>
               <w:ind w:left="120"/>
             </w:pPr>
-            <w:hyperlink w:history="1" r:id="rId7x2mqgiyqy9pomezkrifp">
+            <w:hyperlink w:history="1" r:id="rIdqbysokr_enpki8pjpw_yx">
               <w:r>
                 <w:rPr>
                   <w:rFonts w:ascii="Arial" w:cs="Arial" w:eastAsia="Arial" w:hAnsi="Arial"/>
@@ -8083,6 +8313,65 @@
         </w:tc>
       </w:tr>
     </w:tbl>
+    <w:p>
+      <w:pPr>
+        <w:pBdr>
+          <w:top w:val="single" w:color="BBBBBB" w:sz="4" w:space="4"/>
+        </w:pBdr>
+        <w:spacing w:after="0" w:before="160"/>
+      </w:pPr>
+      <w:r>
+        <w:rPr>
+          <w:rFonts w:ascii="Arial" w:cs="Arial" w:eastAsia="Arial" w:hAnsi="Arial"/>
+          <w:color w:val="666666"/>
+          <w:sz w:val="14"/>
+          <w:szCs w:val="14"/>
+        </w:rPr>
+        <w:t xml:space="preserve">© 2026 SeaVuria and ARES. Aligned with KICD objectives. Developed by SeaVuria; technical implementation by ARES (with AI assistance from Claude). Licensed under </w:t>
+      </w:r>
+      <w:hyperlink w:history="1" r:id="rIdzmx70a9cziu4wp36q4zzw">
+        <w:r>
+          <w:rPr>
+            <w:rFonts w:ascii="Arial" w:cs="Arial" w:eastAsia="Arial" w:hAnsi="Arial"/>
+            <w:color w:val="1F6B75"/>
+            <w:sz w:val="14"/>
+            <w:szCs w:val="14"/>
+            <w:u w:val="single" w:color="1F6B75"/>
+          </w:rPr>
+          <w:t xml:space="preserve">CC BY-NC 4.0</w:t>
+        </w:r>
+      </w:hyperlink>
+      <w:r>
+        <w:rPr>
+          <w:rFonts w:ascii="Arial" w:cs="Arial" w:eastAsia="Arial" w:hAnsi="Arial"/>
+          <w:color w:val="666666"/>
+          <w:sz w:val="14"/>
+          <w:szCs w:val="14"/>
+        </w:rPr>
+        <w:t xml:space="preserve"> (</w:t>
+      </w:r>
+      <w:hyperlink w:history="1" r:id="rIdffgans_yalvmq_syzntuy">
+        <w:r>
+          <w:rPr>
+            <w:rFonts w:ascii="Arial" w:cs="Arial" w:eastAsia="Arial" w:hAnsi="Arial"/>
+            <w:color w:val="1F6B75"/>
+            <w:sz w:val="14"/>
+            <w:szCs w:val="14"/>
+            <w:u w:val="single" w:color="1F6B75"/>
+          </w:rPr>
+          <w:t xml:space="preserve">https://creativecommons.org/licenses/by-nc/4.0/</w:t>
+        </w:r>
+      </w:hyperlink>
+      <w:r>
+        <w:rPr>
+          <w:rFonts w:ascii="Arial" w:cs="Arial" w:eastAsia="Arial" w:hAnsi="Arial"/>
+          <w:color w:val="666666"/>
+          <w:sz w:val="14"/>
+          <w:szCs w:val="14"/>
+        </w:rPr>
+        <w:t xml:space="preserve">).</w:t>
+      </w:r>
+    </w:p>
     <w:p>
       <w:r>
         <w:br w:type="page"/>
@@ -9074,7 +9363,7 @@
             <w:pPr>
               <w:spacing w:after="20" w:before="0"/>
             </w:pPr>
-            <w:hyperlink w:history="1" r:id="rIdzwj0lhstaez1dpqni_xhr">
+            <w:hyperlink w:history="1" r:id="rId4x70zuoavedf4bshxruc5">
               <w:r>
                 <w:rPr>
                   <w:rFonts w:ascii="Arial" w:cs="Arial" w:eastAsia="Arial" w:hAnsi="Arial"/>
@@ -9107,7 +9396,7 @@
               <w:spacing w:after="10" w:before="0"/>
               <w:ind w:left="120"/>
             </w:pPr>
-            <w:hyperlink w:history="1" r:id="rIdodolvsxkt1phg7hlezsvj">
+            <w:hyperlink w:history="1" r:id="rIda-r5wxepa54bpwr_l9tgb">
               <w:r>
                 <w:rPr>
                   <w:rFonts w:ascii="Arial" w:cs="Arial" w:eastAsia="Arial" w:hAnsi="Arial"/>
@@ -9152,7 +9441,7 @@
             <w:pPr>
               <w:spacing w:after="20" w:before="0"/>
             </w:pPr>
-            <w:hyperlink w:history="1" r:id="rIdcc0keytx-wjws8ohymuip">
+            <w:hyperlink w:history="1" r:id="rIdnusjs78zg3aul1pr8kwo2">
               <w:r>
                 <w:rPr>
                   <w:rFonts w:ascii="Arial" w:cs="Arial" w:eastAsia="Arial" w:hAnsi="Arial"/>
@@ -9185,7 +9474,7 @@
               <w:spacing w:after="10" w:before="0"/>
               <w:ind w:left="120"/>
             </w:pPr>
-            <w:hyperlink w:history="1" r:id="rIdtf8ipgcazhk4ovbmabvmb">
+            <w:hyperlink w:history="1" r:id="rIdzclj9nonthkzhhnrk3h_m">
               <w:r>
                 <w:rPr>
                   <w:rFonts w:ascii="Arial" w:cs="Arial" w:eastAsia="Arial" w:hAnsi="Arial"/>
@@ -9380,7 +9669,7 @@
             <w:pPr>
               <w:spacing w:after="20" w:before="0"/>
             </w:pPr>
-            <w:hyperlink w:history="1" r:id="rIdeewzyuccfiv5n3baodrw8">
+            <w:hyperlink w:history="1" r:id="rIdafdopxgoblotpm2qzhghy">
               <w:r>
                 <w:rPr>
                   <w:rFonts w:ascii="Arial" w:cs="Arial" w:eastAsia="Arial" w:hAnsi="Arial"/>
@@ -9413,7 +9702,7 @@
               <w:spacing w:after="10" w:before="0"/>
               <w:ind w:left="120"/>
             </w:pPr>
-            <w:hyperlink w:history="1" r:id="rIdtxtkp7c0vxx9jh5_ij5ws">
+            <w:hyperlink w:history="1" r:id="rIdjrdygckqro5wa5hyztqzp">
               <w:r>
                 <w:rPr>
                   <w:rFonts w:ascii="Arial" w:cs="Arial" w:eastAsia="Arial" w:hAnsi="Arial"/>
@@ -9458,7 +9747,7 @@
             <w:pPr>
               <w:spacing w:after="20" w:before="0"/>
             </w:pPr>
-            <w:hyperlink w:history="1" r:id="rId8qdhrfsqw62fa8jdajivd">
+            <w:hyperlink w:history="1" r:id="rIda6agu4ahch6axcmj0odpj">
               <w:r>
                 <w:rPr>
                   <w:rFonts w:ascii="Arial" w:cs="Arial" w:eastAsia="Arial" w:hAnsi="Arial"/>
@@ -9491,7 +9780,7 @@
               <w:spacing w:after="10" w:before="0"/>
               <w:ind w:left="120"/>
             </w:pPr>
-            <w:hyperlink w:history="1" r:id="rId9ijnuvic7pfsilwfzgbgo">
+            <w:hyperlink w:history="1" r:id="rId_gdse7jslaq2ssyyo7iph">
               <w:r>
                 <w:rPr>
                   <w:rFonts w:ascii="Arial" w:cs="Arial" w:eastAsia="Arial" w:hAnsi="Arial"/>
@@ -9686,7 +9975,7 @@
             <w:pPr>
               <w:spacing w:after="20" w:before="0"/>
             </w:pPr>
-            <w:hyperlink w:history="1" r:id="rIdy5iidovv2zxs_7hzbe-5n">
+            <w:hyperlink w:history="1" r:id="rId6p0t9otc1wtheplwle88j">
               <w:r>
                 <w:rPr>
                   <w:rFonts w:ascii="Arial" w:cs="Arial" w:eastAsia="Arial" w:hAnsi="Arial"/>
@@ -9719,7 +10008,7 @@
               <w:spacing w:after="10" w:before="0"/>
               <w:ind w:left="120"/>
             </w:pPr>
-            <w:hyperlink w:history="1" r:id="rIddwbldmjlfllpwc84bywj2">
+            <w:hyperlink w:history="1" r:id="rIdhjfko1xcfmylerjk4vdn9">
               <w:r>
                 <w:rPr>
                   <w:rFonts w:ascii="Arial" w:cs="Arial" w:eastAsia="Arial" w:hAnsi="Arial"/>
@@ -9764,7 +10053,7 @@
             <w:pPr>
               <w:spacing w:after="20" w:before="0"/>
             </w:pPr>
-            <w:hyperlink w:history="1" r:id="rIdabaghzvxr4zlg4eadaxm_">
+            <w:hyperlink w:history="1" r:id="rIdzfxxja3whr3uvrunh_opp">
               <w:r>
                 <w:rPr>
                   <w:rFonts w:ascii="Arial" w:cs="Arial" w:eastAsia="Arial" w:hAnsi="Arial"/>
@@ -9797,7 +10086,7 @@
               <w:spacing w:after="10" w:before="0"/>
               <w:ind w:left="120"/>
             </w:pPr>
-            <w:hyperlink w:history="1" r:id="rIdqdbdrawmd6ejshxhgxxly">
+            <w:hyperlink w:history="1" r:id="rIdpaigvgoqvhrmt3jxbthvu">
               <w:r>
                 <w:rPr>
                   <w:rFonts w:ascii="Arial" w:cs="Arial" w:eastAsia="Arial" w:hAnsi="Arial"/>
@@ -9992,7 +10281,7 @@
             <w:pPr>
               <w:spacing w:after="20" w:before="0"/>
             </w:pPr>
-            <w:hyperlink w:history="1" r:id="rIdklexrizmu39ivt1dfq2s_">
+            <w:hyperlink w:history="1" r:id="rId8dewvaakm3n99jl-klsqs">
               <w:r>
                 <w:rPr>
                   <w:rFonts w:ascii="Arial" w:cs="Arial" w:eastAsia="Arial" w:hAnsi="Arial"/>
@@ -10025,7 +10314,7 @@
               <w:spacing w:after="10" w:before="0"/>
               <w:ind w:left="120"/>
             </w:pPr>
-            <w:hyperlink w:history="1" r:id="rIdtelaavvu-ztjzbupqq6ql">
+            <w:hyperlink w:history="1" r:id="rIdpyz7qftuk79qb6m71mjsx">
               <w:r>
                 <w:rPr>
                   <w:rFonts w:ascii="Arial" w:cs="Arial" w:eastAsia="Arial" w:hAnsi="Arial"/>
@@ -10070,7 +10359,7 @@
             <w:pPr>
               <w:spacing w:after="20" w:before="0"/>
             </w:pPr>
-            <w:hyperlink w:history="1" r:id="rIdtiz95_dgaziau0hxqjkg0">
+            <w:hyperlink w:history="1" r:id="rId1qaogdt_ucrttw5oavazo">
               <w:r>
                 <w:rPr>
                   <w:rFonts w:ascii="Arial" w:cs="Arial" w:eastAsia="Arial" w:hAnsi="Arial"/>
@@ -10103,7 +10392,7 @@
               <w:spacing w:after="10" w:before="0"/>
               <w:ind w:left="120"/>
             </w:pPr>
-            <w:hyperlink w:history="1" r:id="rIdlhtfu3yff7tu61xorwurg">
+            <w:hyperlink w:history="1" r:id="rIduamr9py0884vjzg1wdrjh">
               <w:r>
                 <w:rPr>
                   <w:rFonts w:ascii="Arial" w:cs="Arial" w:eastAsia="Arial" w:hAnsi="Arial"/>
@@ -10298,7 +10587,7 @@
             <w:pPr>
               <w:spacing w:after="20" w:before="0"/>
             </w:pPr>
-            <w:hyperlink w:history="1" r:id="rId7q8hpl_zcwc2r4aqjtkiq">
+            <w:hyperlink w:history="1" r:id="rIdiphswug0j5dpqt1dtgmjf">
               <w:r>
                 <w:rPr>
                   <w:rFonts w:ascii="Arial" w:cs="Arial" w:eastAsia="Arial" w:hAnsi="Arial"/>
@@ -10331,7 +10620,7 @@
               <w:spacing w:after="10" w:before="0"/>
               <w:ind w:left="120"/>
             </w:pPr>
-            <w:hyperlink w:history="1" r:id="rIdqcvnnaapifs9-ohpfk_od">
+            <w:hyperlink w:history="1" r:id="rIddkepynz54jpu8tjjwx11a">
               <w:r>
                 <w:rPr>
                   <w:rFonts w:ascii="Arial" w:cs="Arial" w:eastAsia="Arial" w:hAnsi="Arial"/>
@@ -10376,7 +10665,7 @@
             <w:pPr>
               <w:spacing w:after="20" w:before="0"/>
             </w:pPr>
-            <w:hyperlink w:history="1" r:id="rIdnzlaxhsisctuygtar4lpt">
+            <w:hyperlink w:history="1" r:id="rIdr8tle5bjkgtbebkwcclbr">
               <w:r>
                 <w:rPr>
                   <w:rFonts w:ascii="Arial" w:cs="Arial" w:eastAsia="Arial" w:hAnsi="Arial"/>
@@ -10409,7 +10698,7 @@
               <w:spacing w:after="10" w:before="0"/>
               <w:ind w:left="120"/>
             </w:pPr>
-            <w:hyperlink w:history="1" r:id="rId5tnkflhwyuqmpiy6qtpqa">
+            <w:hyperlink w:history="1" r:id="rIdza3wvqwbu1srdh3y6wvwp">
               <w:r>
                 <w:rPr>
                   <w:rFonts w:ascii="Arial" w:cs="Arial" w:eastAsia="Arial" w:hAnsi="Arial"/>
@@ -10905,6 +11194,65 @@
         </w:tc>
       </w:tr>
     </w:tbl>
+    <w:p>
+      <w:pPr>
+        <w:pBdr>
+          <w:top w:val="single" w:color="BBBBBB" w:sz="4" w:space="4"/>
+        </w:pBdr>
+        <w:spacing w:after="0" w:before="160"/>
+      </w:pPr>
+      <w:r>
+        <w:rPr>
+          <w:rFonts w:ascii="Arial" w:cs="Arial" w:eastAsia="Arial" w:hAnsi="Arial"/>
+          <w:color w:val="666666"/>
+          <w:sz w:val="14"/>
+          <w:szCs w:val="14"/>
+        </w:rPr>
+        <w:t xml:space="preserve">© 2026 SeaVuria and ARES. Aligned with KICD objectives. Developed by SeaVuria; technical implementation by ARES (with AI assistance from Claude). Licensed under </w:t>
+      </w:r>
+      <w:hyperlink w:history="1" r:id="rIdy_yhy0bips2njajc1pk9v">
+        <w:r>
+          <w:rPr>
+            <w:rFonts w:ascii="Arial" w:cs="Arial" w:eastAsia="Arial" w:hAnsi="Arial"/>
+            <w:color w:val="1F6B75"/>
+            <w:sz w:val="14"/>
+            <w:szCs w:val="14"/>
+            <w:u w:val="single" w:color="1F6B75"/>
+          </w:rPr>
+          <w:t xml:space="preserve">CC BY-NC 4.0</w:t>
+        </w:r>
+      </w:hyperlink>
+      <w:r>
+        <w:rPr>
+          <w:rFonts w:ascii="Arial" w:cs="Arial" w:eastAsia="Arial" w:hAnsi="Arial"/>
+          <w:color w:val="666666"/>
+          <w:sz w:val="14"/>
+          <w:szCs w:val="14"/>
+        </w:rPr>
+        <w:t xml:space="preserve"> (</w:t>
+      </w:r>
+      <w:hyperlink w:history="1" r:id="rIdqbhhuhi57whrsu_utginz">
+        <w:r>
+          <w:rPr>
+            <w:rFonts w:ascii="Arial" w:cs="Arial" w:eastAsia="Arial" w:hAnsi="Arial"/>
+            <w:color w:val="1F6B75"/>
+            <w:sz w:val="14"/>
+            <w:szCs w:val="14"/>
+            <w:u w:val="single" w:color="1F6B75"/>
+          </w:rPr>
+          <w:t xml:space="preserve">https://creativecommons.org/licenses/by-nc/4.0/</w:t>
+        </w:r>
+      </w:hyperlink>
+      <w:r>
+        <w:rPr>
+          <w:rFonts w:ascii="Arial" w:cs="Arial" w:eastAsia="Arial" w:hAnsi="Arial"/>
+          <w:color w:val="666666"/>
+          <w:sz w:val="14"/>
+          <w:szCs w:val="14"/>
+        </w:rPr>
+        <w:t xml:space="preserve">).</w:t>
+      </w:r>
+    </w:p>
     <w:p>
       <w:r>
         <w:br w:type="page"/>
@@ -11896,7 +12244,7 @@
             <w:pPr>
               <w:spacing w:after="20" w:before="0"/>
             </w:pPr>
-            <w:hyperlink w:history="1" r:id="rId3t1ecfokp8qfcjthaxiuz">
+            <w:hyperlink w:history="1" r:id="rIdepgzn5_ogxgzkvbraexmw">
               <w:r>
                 <w:rPr>
                   <w:rFonts w:ascii="Arial" w:cs="Arial" w:eastAsia="Arial" w:hAnsi="Arial"/>
@@ -11929,7 +12277,7 @@
               <w:spacing w:after="10" w:before="0"/>
               <w:ind w:left="120"/>
             </w:pPr>
-            <w:hyperlink w:history="1" r:id="rId0dp-crxxhqgg9gd59iwrr">
+            <w:hyperlink w:history="1" r:id="rIdm1qvdemacl1t4kv5xo2xr">
               <w:r>
                 <w:rPr>
                   <w:rFonts w:ascii="Arial" w:cs="Arial" w:eastAsia="Arial" w:hAnsi="Arial"/>
@@ -11974,7 +12322,7 @@
             <w:pPr>
               <w:spacing w:after="20" w:before="0"/>
             </w:pPr>
-            <w:hyperlink w:history="1" r:id="rIdszqjkyh1jj8d-gkkzmdpm">
+            <w:hyperlink w:history="1" r:id="rIdaoeacul8rcemc3zfamzrr">
               <w:r>
                 <w:rPr>
                   <w:rFonts w:ascii="Arial" w:cs="Arial" w:eastAsia="Arial" w:hAnsi="Arial"/>
@@ -12007,7 +12355,7 @@
               <w:spacing w:after="10" w:before="0"/>
               <w:ind w:left="120"/>
             </w:pPr>
-            <w:hyperlink w:history="1" r:id="rIdex8a3lb2pc_og9zco94xs">
+            <w:hyperlink w:history="1" r:id="rIdc_rt4f8nvvto117z36zdq">
               <w:r>
                 <w:rPr>
                   <w:rFonts w:ascii="Arial" w:cs="Arial" w:eastAsia="Arial" w:hAnsi="Arial"/>
@@ -12202,7 +12550,7 @@
             <w:pPr>
               <w:spacing w:after="20" w:before="0"/>
             </w:pPr>
-            <w:hyperlink w:history="1" r:id="rIdjilgdz5yvk62zwc77x0h0">
+            <w:hyperlink w:history="1" r:id="rIdhbt5jzkzgszzi5fvrllri">
               <w:r>
                 <w:rPr>
                   <w:rFonts w:ascii="Arial" w:cs="Arial" w:eastAsia="Arial" w:hAnsi="Arial"/>
@@ -12235,7 +12583,7 @@
               <w:spacing w:after="10" w:before="0"/>
               <w:ind w:left="120"/>
             </w:pPr>
-            <w:hyperlink w:history="1" r:id="rId1jvbmdgcikr2ip4e-bruc">
+            <w:hyperlink w:history="1" r:id="rIdiu7fofwtg27pw8esr1yod">
               <w:r>
                 <w:rPr>
                   <w:rFonts w:ascii="Arial" w:cs="Arial" w:eastAsia="Arial" w:hAnsi="Arial"/>
@@ -12280,7 +12628,7 @@
             <w:pPr>
               <w:spacing w:after="20" w:before="0"/>
             </w:pPr>
-            <w:hyperlink w:history="1" r:id="rIdehdbp6kokzza0bhnujnaw">
+            <w:hyperlink w:history="1" r:id="rIddrcefp80qab7fexbulx5y">
               <w:r>
                 <w:rPr>
                   <w:rFonts w:ascii="Arial" w:cs="Arial" w:eastAsia="Arial" w:hAnsi="Arial"/>
@@ -12313,7 +12661,7 @@
               <w:spacing w:after="10" w:before="0"/>
               <w:ind w:left="120"/>
             </w:pPr>
-            <w:hyperlink w:history="1" r:id="rIdcionytcbfkgzeaft6meab">
+            <w:hyperlink w:history="1" r:id="rIdlumblfzs82vheptwokyry">
               <w:r>
                 <w:rPr>
                   <w:rFonts w:ascii="Arial" w:cs="Arial" w:eastAsia="Arial" w:hAnsi="Arial"/>
@@ -12508,7 +12856,7 @@
             <w:pPr>
               <w:spacing w:after="20" w:before="0"/>
             </w:pPr>
-            <w:hyperlink w:history="1" r:id="rIddlnugvzouvcb9kzbitsbo">
+            <w:hyperlink w:history="1" r:id="rIdl7fo1lugrnivlubhfp31q">
               <w:r>
                 <w:rPr>
                   <w:rFonts w:ascii="Arial" w:cs="Arial" w:eastAsia="Arial" w:hAnsi="Arial"/>
@@ -12541,7 +12889,7 @@
               <w:spacing w:after="10" w:before="0"/>
               <w:ind w:left="120"/>
             </w:pPr>
-            <w:hyperlink w:history="1" r:id="rIdvvknmrkc4v0ldu0tx6yoy">
+            <w:hyperlink w:history="1" r:id="rIdfxrpon-plhpqnp07qww7x">
               <w:r>
                 <w:rPr>
                   <w:rFonts w:ascii="Arial" w:cs="Arial" w:eastAsia="Arial" w:hAnsi="Arial"/>
@@ -12586,7 +12934,7 @@
             <w:pPr>
               <w:spacing w:after="20" w:before="0"/>
             </w:pPr>
-            <w:hyperlink w:history="1" r:id="rId_o6aurf65byhf97o5ni4g">
+            <w:hyperlink w:history="1" r:id="rId3e-01rcjo5ry084yqf9cf">
               <w:r>
                 <w:rPr>
                   <w:rFonts w:ascii="Arial" w:cs="Arial" w:eastAsia="Arial" w:hAnsi="Arial"/>
@@ -12619,7 +12967,7 @@
               <w:spacing w:after="10" w:before="0"/>
               <w:ind w:left="120"/>
             </w:pPr>
-            <w:hyperlink w:history="1" r:id="rId_oi_fe4b1nfmmltuiamoi">
+            <w:hyperlink w:history="1" r:id="rIdonjc-kg8_naxr1yo1qy7-">
               <w:r>
                 <w:rPr>
                   <w:rFonts w:ascii="Arial" w:cs="Arial" w:eastAsia="Arial" w:hAnsi="Arial"/>
@@ -12814,7 +13162,7 @@
             <w:pPr>
               <w:spacing w:after="20" w:before="0"/>
             </w:pPr>
-            <w:hyperlink w:history="1" r:id="rIdqllmhbvnikzlcfubfssxd">
+            <w:hyperlink w:history="1" r:id="rId_yewextuzkiyiuw5yldsq">
               <w:r>
                 <w:rPr>
                   <w:rFonts w:ascii="Arial" w:cs="Arial" w:eastAsia="Arial" w:hAnsi="Arial"/>
@@ -12847,7 +13195,7 @@
               <w:spacing w:after="10" w:before="0"/>
               <w:ind w:left="120"/>
             </w:pPr>
-            <w:hyperlink w:history="1" r:id="rIdtoflnfxtkgf-tok2gmizt">
+            <w:hyperlink w:history="1" r:id="rIdo4cvazh6rooo6jissmsai">
               <w:r>
                 <w:rPr>
                   <w:rFonts w:ascii="Arial" w:cs="Arial" w:eastAsia="Arial" w:hAnsi="Arial"/>
@@ -12892,7 +13240,7 @@
             <w:pPr>
               <w:spacing w:after="20" w:before="0"/>
             </w:pPr>
-            <w:hyperlink w:history="1" r:id="rIdg_i8dad3slgcb8flfojko">
+            <w:hyperlink w:history="1" r:id="rId13lqx0u4fdrrxksvm501t">
               <w:r>
                 <w:rPr>
                   <w:rFonts w:ascii="Arial" w:cs="Arial" w:eastAsia="Arial" w:hAnsi="Arial"/>
@@ -12925,7 +13273,7 @@
               <w:spacing w:after="10" w:before="0"/>
               <w:ind w:left="120"/>
             </w:pPr>
-            <w:hyperlink w:history="1" r:id="rIdjeruy3l3ew8dkhloruquv">
+            <w:hyperlink w:history="1" r:id="rIdexcwkpl0uaixywk4iilyg">
               <w:r>
                 <w:rPr>
                   <w:rFonts w:ascii="Arial" w:cs="Arial" w:eastAsia="Arial" w:hAnsi="Arial"/>
@@ -13120,7 +13468,7 @@
             <w:pPr>
               <w:spacing w:after="20" w:before="0"/>
             </w:pPr>
-            <w:hyperlink w:history="1" r:id="rIdhixomgpcl1a5honjy2egl">
+            <w:hyperlink w:history="1" r:id="rIdqacibjlqz1dnmks2uycww">
               <w:r>
                 <w:rPr>
                   <w:rFonts w:ascii="Arial" w:cs="Arial" w:eastAsia="Arial" w:hAnsi="Arial"/>
@@ -13153,7 +13501,7 @@
               <w:spacing w:after="10" w:before="0"/>
               <w:ind w:left="120"/>
             </w:pPr>
-            <w:hyperlink w:history="1" r:id="rIdmy2vm99kkf8ta4zwsqhxc">
+            <w:hyperlink w:history="1" r:id="rIddyyj8i0pqi21ez02_so_d">
               <w:r>
                 <w:rPr>
                   <w:rFonts w:ascii="Arial" w:cs="Arial" w:eastAsia="Arial" w:hAnsi="Arial"/>
@@ -13198,7 +13546,7 @@
             <w:pPr>
               <w:spacing w:after="20" w:before="0"/>
             </w:pPr>
-            <w:hyperlink w:history="1" r:id="rIdwmhww_xj9zjqzi4mompm4">
+            <w:hyperlink w:history="1" r:id="rId0fngwmj_2nxzyq8aub5kd">
               <w:r>
                 <w:rPr>
                   <w:rFonts w:ascii="Arial" w:cs="Arial" w:eastAsia="Arial" w:hAnsi="Arial"/>
@@ -13231,7 +13579,7 @@
               <w:spacing w:after="10" w:before="0"/>
               <w:ind w:left="120"/>
             </w:pPr>
-            <w:hyperlink w:history="1" r:id="rIdzb2oanhwxrl9uchjzflbh">
+            <w:hyperlink w:history="1" r:id="rIdyjit2cxdkkst2argb11nb">
               <w:r>
                 <w:rPr>
                   <w:rFonts w:ascii="Arial" w:cs="Arial" w:eastAsia="Arial" w:hAnsi="Arial"/>
@@ -13727,6 +14075,65 @@
         </w:tc>
       </w:tr>
     </w:tbl>
+    <w:p>
+      <w:pPr>
+        <w:pBdr>
+          <w:top w:val="single" w:color="BBBBBB" w:sz="4" w:space="4"/>
+        </w:pBdr>
+        <w:spacing w:after="0" w:before="160"/>
+      </w:pPr>
+      <w:r>
+        <w:rPr>
+          <w:rFonts w:ascii="Arial" w:cs="Arial" w:eastAsia="Arial" w:hAnsi="Arial"/>
+          <w:color w:val="666666"/>
+          <w:sz w:val="14"/>
+          <w:szCs w:val="14"/>
+        </w:rPr>
+        <w:t xml:space="preserve">© 2026 SeaVuria and ARES. Aligned with KICD objectives. Developed by SeaVuria; technical implementation by ARES (with AI assistance from Claude). Licensed under </w:t>
+      </w:r>
+      <w:hyperlink w:history="1" r:id="rIddeim3lsqx_q7oslgid3vc">
+        <w:r>
+          <w:rPr>
+            <w:rFonts w:ascii="Arial" w:cs="Arial" w:eastAsia="Arial" w:hAnsi="Arial"/>
+            <w:color w:val="1F6B75"/>
+            <w:sz w:val="14"/>
+            <w:szCs w:val="14"/>
+            <w:u w:val="single" w:color="1F6B75"/>
+          </w:rPr>
+          <w:t xml:space="preserve">CC BY-NC 4.0</w:t>
+        </w:r>
+      </w:hyperlink>
+      <w:r>
+        <w:rPr>
+          <w:rFonts w:ascii="Arial" w:cs="Arial" w:eastAsia="Arial" w:hAnsi="Arial"/>
+          <w:color w:val="666666"/>
+          <w:sz w:val="14"/>
+          <w:szCs w:val="14"/>
+        </w:rPr>
+        <w:t xml:space="preserve"> (</w:t>
+      </w:r>
+      <w:hyperlink w:history="1" r:id="rIdmn0e5uaqkrepfhvsvungc">
+        <w:r>
+          <w:rPr>
+            <w:rFonts w:ascii="Arial" w:cs="Arial" w:eastAsia="Arial" w:hAnsi="Arial"/>
+            <w:color w:val="1F6B75"/>
+            <w:sz w:val="14"/>
+            <w:szCs w:val="14"/>
+            <w:u w:val="single" w:color="1F6B75"/>
+          </w:rPr>
+          <w:t xml:space="preserve">https://creativecommons.org/licenses/by-nc/4.0/</w:t>
+        </w:r>
+      </w:hyperlink>
+      <w:r>
+        <w:rPr>
+          <w:rFonts w:ascii="Arial" w:cs="Arial" w:eastAsia="Arial" w:hAnsi="Arial"/>
+          <w:color w:val="666666"/>
+          <w:sz w:val="14"/>
+          <w:szCs w:val="14"/>
+        </w:rPr>
+        <w:t xml:space="preserve">).</w:t>
+      </w:r>
+    </w:p>
     <w:p>
       <w:r>
         <w:br w:type="page"/>
@@ -14718,7 +15125,7 @@
             <w:pPr>
               <w:spacing w:after="20" w:before="0"/>
             </w:pPr>
-            <w:hyperlink w:history="1" r:id="rIdcodxiqtsgljj_vmeh3iua">
+            <w:hyperlink w:history="1" r:id="rIdnaj00ct2cf4enp0mhrps3">
               <w:r>
                 <w:rPr>
                   <w:rFonts w:ascii="Arial" w:cs="Arial" w:eastAsia="Arial" w:hAnsi="Arial"/>
@@ -14751,7 +15158,7 @@
               <w:spacing w:after="10" w:before="0"/>
               <w:ind w:left="120"/>
             </w:pPr>
-            <w:hyperlink w:history="1" r:id="rIdan3dvvk-ekamvznkyai0h">
+            <w:hyperlink w:history="1" r:id="rIdln7z2ly0jl_an7l6uq1-f">
               <w:r>
                 <w:rPr>
                   <w:rFonts w:ascii="Arial" w:cs="Arial" w:eastAsia="Arial" w:hAnsi="Arial"/>
@@ -14796,7 +15203,7 @@
             <w:pPr>
               <w:spacing w:after="20" w:before="0"/>
             </w:pPr>
-            <w:hyperlink w:history="1" r:id="rIdd17robtulud4u2jg8xjwt">
+            <w:hyperlink w:history="1" r:id="rIdks0hmutgqicxdj5jotuhb">
               <w:r>
                 <w:rPr>
                   <w:rFonts w:ascii="Arial" w:cs="Arial" w:eastAsia="Arial" w:hAnsi="Arial"/>
@@ -14829,7 +15236,7 @@
               <w:spacing w:after="10" w:before="0"/>
               <w:ind w:left="120"/>
             </w:pPr>
-            <w:hyperlink w:history="1" r:id="rIdaktfdqofi18tvr9fjyljk">
+            <w:hyperlink w:history="1" r:id="rIdvgr3j5n13gtxcqrekinwu">
               <w:r>
                 <w:rPr>
                   <w:rFonts w:ascii="Arial" w:cs="Arial" w:eastAsia="Arial" w:hAnsi="Arial"/>
@@ -15024,7 +15431,7 @@
             <w:pPr>
               <w:spacing w:after="20" w:before="0"/>
             </w:pPr>
-            <w:hyperlink w:history="1" r:id="rIdu1lifuso2ur6rnezvvfae">
+            <w:hyperlink w:history="1" r:id="rIdr20csmt-ewetr0uag71fy">
               <w:r>
                 <w:rPr>
                   <w:rFonts w:ascii="Arial" w:cs="Arial" w:eastAsia="Arial" w:hAnsi="Arial"/>
@@ -15057,7 +15464,7 @@
               <w:spacing w:after="10" w:before="0"/>
               <w:ind w:left="120"/>
             </w:pPr>
-            <w:hyperlink w:history="1" r:id="rId-jjqctdyao8pp00fig160">
+            <w:hyperlink w:history="1" r:id="rIdrdy2p7uxlerfb6o7tuedp">
               <w:r>
                 <w:rPr>
                   <w:rFonts w:ascii="Arial" w:cs="Arial" w:eastAsia="Arial" w:hAnsi="Arial"/>
@@ -15102,7 +15509,7 @@
             <w:pPr>
               <w:spacing w:after="20" w:before="0"/>
             </w:pPr>
-            <w:hyperlink w:history="1" r:id="rIdjleoztctbhjtzxkqj5_wu">
+            <w:hyperlink w:history="1" r:id="rIdedxfgjxj6hpnisc8jrcer">
               <w:r>
                 <w:rPr>
                   <w:rFonts w:ascii="Arial" w:cs="Arial" w:eastAsia="Arial" w:hAnsi="Arial"/>
@@ -15135,7 +15542,7 @@
               <w:spacing w:after="10" w:before="0"/>
               <w:ind w:left="120"/>
             </w:pPr>
-            <w:hyperlink w:history="1" r:id="rIdbf86mubs57m5ymgpfxsot">
+            <w:hyperlink w:history="1" r:id="rIdo5mmyvfjbu1adije3-bwm">
               <w:r>
                 <w:rPr>
                   <w:rFonts w:ascii="Arial" w:cs="Arial" w:eastAsia="Arial" w:hAnsi="Arial"/>
@@ -15330,7 +15737,7 @@
             <w:pPr>
               <w:spacing w:after="20" w:before="0"/>
             </w:pPr>
-            <w:hyperlink w:history="1" r:id="rIdkj058wjoiudvekbafmvu2">
+            <w:hyperlink w:history="1" r:id="rId7nazjlcxm-ylf3eearqvn">
               <w:r>
                 <w:rPr>
                   <w:rFonts w:ascii="Arial" w:cs="Arial" w:eastAsia="Arial" w:hAnsi="Arial"/>
@@ -15363,7 +15770,7 @@
               <w:spacing w:after="10" w:before="0"/>
               <w:ind w:left="120"/>
             </w:pPr>
-            <w:hyperlink w:history="1" r:id="rIddzwxuitcdacjapfbasqbe">
+            <w:hyperlink w:history="1" r:id="rIdqe8fczmbdcdthkxqmzpja">
               <w:r>
                 <w:rPr>
                   <w:rFonts w:ascii="Arial" w:cs="Arial" w:eastAsia="Arial" w:hAnsi="Arial"/>
@@ -15408,7 +15815,7 @@
             <w:pPr>
               <w:spacing w:after="20" w:before="0"/>
             </w:pPr>
-            <w:hyperlink w:history="1" r:id="rIdade5rhreehnbcm5jcsc4f">
+            <w:hyperlink w:history="1" r:id="rId2ysy1rl2k0eicjteskgsb">
               <w:r>
                 <w:rPr>
                   <w:rFonts w:ascii="Arial" w:cs="Arial" w:eastAsia="Arial" w:hAnsi="Arial"/>
@@ -15441,7 +15848,7 @@
               <w:spacing w:after="10" w:before="0"/>
               <w:ind w:left="120"/>
             </w:pPr>
-            <w:hyperlink w:history="1" r:id="rIdqwiclidkhokxfdiusrd7n">
+            <w:hyperlink w:history="1" r:id="rIdvfvzu1_yzhvzbttkk1_vd">
               <w:r>
                 <w:rPr>
                   <w:rFonts w:ascii="Arial" w:cs="Arial" w:eastAsia="Arial" w:hAnsi="Arial"/>
@@ -15636,7 +16043,7 @@
             <w:pPr>
               <w:spacing w:after="20" w:before="0"/>
             </w:pPr>
-            <w:hyperlink w:history="1" r:id="rIdy_asm1r27izqhk5gzzrn5">
+            <w:hyperlink w:history="1" r:id="rId2oo3havntxnozzc3x-u0n">
               <w:r>
                 <w:rPr>
                   <w:rFonts w:ascii="Arial" w:cs="Arial" w:eastAsia="Arial" w:hAnsi="Arial"/>
@@ -15669,7 +16076,7 @@
               <w:spacing w:after="10" w:before="0"/>
               <w:ind w:left="120"/>
             </w:pPr>
-            <w:hyperlink w:history="1" r:id="rIdlpib2pzpmim9enhwtb7wl">
+            <w:hyperlink w:history="1" r:id="rIdbi-p-dqadw1t1jkhig2kw">
               <w:r>
                 <w:rPr>
                   <w:rFonts w:ascii="Arial" w:cs="Arial" w:eastAsia="Arial" w:hAnsi="Arial"/>
@@ -15714,7 +16121,7 @@
             <w:pPr>
               <w:spacing w:after="20" w:before="0"/>
             </w:pPr>
-            <w:hyperlink w:history="1" r:id="rIdfycsjqxgi2h9pokqajork">
+            <w:hyperlink w:history="1" r:id="rIddrtuhbz8ahdyfimmsggcc">
               <w:r>
                 <w:rPr>
                   <w:rFonts w:ascii="Arial" w:cs="Arial" w:eastAsia="Arial" w:hAnsi="Arial"/>
@@ -15747,7 +16154,7 @@
               <w:spacing w:after="10" w:before="0"/>
               <w:ind w:left="120"/>
             </w:pPr>
-            <w:hyperlink w:history="1" r:id="rIdrdcfhe15qcnlnqj8rqka8">
+            <w:hyperlink w:history="1" r:id="rIdmoyyulnyfsrnhx3wuxtsr">
               <w:r>
                 <w:rPr>
                   <w:rFonts w:ascii="Arial" w:cs="Arial" w:eastAsia="Arial" w:hAnsi="Arial"/>
@@ -15942,7 +16349,7 @@
             <w:pPr>
               <w:spacing w:after="20" w:before="0"/>
             </w:pPr>
-            <w:hyperlink w:history="1" r:id="rId5wocxty20_er3tojo1qqf">
+            <w:hyperlink w:history="1" r:id="rIdcfu5ygjm5f3mx22gpud2e">
               <w:r>
                 <w:rPr>
                   <w:rFonts w:ascii="Arial" w:cs="Arial" w:eastAsia="Arial" w:hAnsi="Arial"/>
@@ -15975,7 +16382,7 @@
               <w:spacing w:after="10" w:before="0"/>
               <w:ind w:left="120"/>
             </w:pPr>
-            <w:hyperlink w:history="1" r:id="rIdolqpp_2wle0oqcb9r9urj">
+            <w:hyperlink w:history="1" r:id="rIdrimwck_jbcs9sybkkun2w">
               <w:r>
                 <w:rPr>
                   <w:rFonts w:ascii="Arial" w:cs="Arial" w:eastAsia="Arial" w:hAnsi="Arial"/>
@@ -16020,7 +16427,7 @@
             <w:pPr>
               <w:spacing w:after="20" w:before="0"/>
             </w:pPr>
-            <w:hyperlink w:history="1" r:id="rIdzbsanzodf5eocprcaw1p5">
+            <w:hyperlink w:history="1" r:id="rIdw9ncw9njriwtuio8oagj2">
               <w:r>
                 <w:rPr>
                   <w:rFonts w:ascii="Arial" w:cs="Arial" w:eastAsia="Arial" w:hAnsi="Arial"/>
@@ -16053,7 +16460,7 @@
               <w:spacing w:after="10" w:before="0"/>
               <w:ind w:left="120"/>
             </w:pPr>
-            <w:hyperlink w:history="1" r:id="rIdtvkc1qqzsinjj2bszffpd">
+            <w:hyperlink w:history="1" r:id="rIdyozz4ppr4jl9qtro5735q">
               <w:r>
                 <w:rPr>
                   <w:rFonts w:ascii="Arial" w:cs="Arial" w:eastAsia="Arial" w:hAnsi="Arial"/>
@@ -16663,6 +17070,65 @@
         </w:tc>
       </w:tr>
     </w:tbl>
+    <w:p>
+      <w:pPr>
+        <w:pBdr>
+          <w:top w:val="single" w:color="BBBBBB" w:sz="4" w:space="4"/>
+        </w:pBdr>
+        <w:spacing w:after="0" w:before="160"/>
+      </w:pPr>
+      <w:r>
+        <w:rPr>
+          <w:rFonts w:ascii="Arial" w:cs="Arial" w:eastAsia="Arial" w:hAnsi="Arial"/>
+          <w:color w:val="666666"/>
+          <w:sz w:val="14"/>
+          <w:szCs w:val="14"/>
+        </w:rPr>
+        <w:t xml:space="preserve">© 2026 SeaVuria and ARES. Aligned with KICD objectives. Developed by SeaVuria; technical implementation by ARES (with AI assistance from Claude). Licensed under </w:t>
+      </w:r>
+      <w:hyperlink w:history="1" r:id="rIddahmxz1xa9pwkvt0vefip">
+        <w:r>
+          <w:rPr>
+            <w:rFonts w:ascii="Arial" w:cs="Arial" w:eastAsia="Arial" w:hAnsi="Arial"/>
+            <w:color w:val="1F6B75"/>
+            <w:sz w:val="14"/>
+            <w:szCs w:val="14"/>
+            <w:u w:val="single" w:color="1F6B75"/>
+          </w:rPr>
+          <w:t xml:space="preserve">CC BY-NC 4.0</w:t>
+        </w:r>
+      </w:hyperlink>
+      <w:r>
+        <w:rPr>
+          <w:rFonts w:ascii="Arial" w:cs="Arial" w:eastAsia="Arial" w:hAnsi="Arial"/>
+          <w:color w:val="666666"/>
+          <w:sz w:val="14"/>
+          <w:szCs w:val="14"/>
+        </w:rPr>
+        <w:t xml:space="preserve"> (</w:t>
+      </w:r>
+      <w:hyperlink w:history="1" r:id="rIdn5uufvsvndtupxpnivbyn">
+        <w:r>
+          <w:rPr>
+            <w:rFonts w:ascii="Arial" w:cs="Arial" w:eastAsia="Arial" w:hAnsi="Arial"/>
+            <w:color w:val="1F6B75"/>
+            <w:sz w:val="14"/>
+            <w:szCs w:val="14"/>
+            <w:u w:val="single" w:color="1F6B75"/>
+          </w:rPr>
+          <w:t xml:space="preserve">https://creativecommons.org/licenses/by-nc/4.0/</w:t>
+        </w:r>
+      </w:hyperlink>
+      <w:r>
+        <w:rPr>
+          <w:rFonts w:ascii="Arial" w:cs="Arial" w:eastAsia="Arial" w:hAnsi="Arial"/>
+          <w:color w:val="666666"/>
+          <w:sz w:val="14"/>
+          <w:szCs w:val="14"/>
+        </w:rPr>
+        <w:t xml:space="preserve">).</w:t>
+      </w:r>
+    </w:p>
     <w:p>
       <w:r>
         <w:br w:type="page"/>
@@ -17654,7 +18120,7 @@
             <w:pPr>
               <w:spacing w:after="20" w:before="0"/>
             </w:pPr>
-            <w:hyperlink w:history="1" r:id="rIdukgo9eb7sm_ckli12e5kt">
+            <w:hyperlink w:history="1" r:id="rIdflupv9s1oanupu1cqjwje">
               <w:r>
                 <w:rPr>
                   <w:rFonts w:ascii="Arial" w:cs="Arial" w:eastAsia="Arial" w:hAnsi="Arial"/>
@@ -17687,7 +18153,7 @@
               <w:spacing w:after="10" w:before="0"/>
               <w:ind w:left="120"/>
             </w:pPr>
-            <w:hyperlink w:history="1" r:id="rId3l51k3pmfihh0bdxmuc_-">
+            <w:hyperlink w:history="1" r:id="rIduppilxxa7wrvpb28dbynn">
               <w:r>
                 <w:rPr>
                   <w:rFonts w:ascii="Arial" w:cs="Arial" w:eastAsia="Arial" w:hAnsi="Arial"/>
@@ -17732,7 +18198,7 @@
             <w:pPr>
               <w:spacing w:after="20" w:before="0"/>
             </w:pPr>
-            <w:hyperlink w:history="1" r:id="rIdqywx3bdp4hw5nd_wks9bh">
+            <w:hyperlink w:history="1" r:id="rIdvb-mo4sg6dnxrzjhvu1bp">
               <w:r>
                 <w:rPr>
                   <w:rFonts w:ascii="Arial" w:cs="Arial" w:eastAsia="Arial" w:hAnsi="Arial"/>
@@ -17765,7 +18231,7 @@
               <w:spacing w:after="10" w:before="0"/>
               <w:ind w:left="120"/>
             </w:pPr>
-            <w:hyperlink w:history="1" r:id="rIdx6jetuepf8puunv3w4aah">
+            <w:hyperlink w:history="1" r:id="rIdvencpuqclwfpfxmhdcsgf">
               <w:r>
                 <w:rPr>
                   <w:rFonts w:ascii="Arial" w:cs="Arial" w:eastAsia="Arial" w:hAnsi="Arial"/>
@@ -17960,7 +18426,7 @@
             <w:pPr>
               <w:spacing w:after="20" w:before="0"/>
             </w:pPr>
-            <w:hyperlink w:history="1" r:id="rId6tms_l3evf46ydvit1mxp">
+            <w:hyperlink w:history="1" r:id="rIdas-ryv2mom3yxq7fskicp">
               <w:r>
                 <w:rPr>
                   <w:rFonts w:ascii="Arial" w:cs="Arial" w:eastAsia="Arial" w:hAnsi="Arial"/>
@@ -17993,7 +18459,7 @@
               <w:spacing w:after="10" w:before="0"/>
               <w:ind w:left="120"/>
             </w:pPr>
-            <w:hyperlink w:history="1" r:id="rIdg9bgyyjlczaea2d2citxn">
+            <w:hyperlink w:history="1" r:id="rId1dbmxiqwkfdmd_yjqbzb-">
               <w:r>
                 <w:rPr>
                   <w:rFonts w:ascii="Arial" w:cs="Arial" w:eastAsia="Arial" w:hAnsi="Arial"/>
@@ -18038,7 +18504,7 @@
             <w:pPr>
               <w:spacing w:after="20" w:before="0"/>
             </w:pPr>
-            <w:hyperlink w:history="1" r:id="rIdhjpvuscrza8abcmh0lck6">
+            <w:hyperlink w:history="1" r:id="rIdhc_i6_fjlkkrjk9yo88lo">
               <w:r>
                 <w:rPr>
                   <w:rFonts w:ascii="Arial" w:cs="Arial" w:eastAsia="Arial" w:hAnsi="Arial"/>
@@ -18071,7 +18537,7 @@
               <w:spacing w:after="10" w:before="0"/>
               <w:ind w:left="120"/>
             </w:pPr>
-            <w:hyperlink w:history="1" r:id="rIdk12bo04tutu22ll5n0nq4">
+            <w:hyperlink w:history="1" r:id="rIddijoisb62cejj_3mj20qf">
               <w:r>
                 <w:rPr>
                   <w:rFonts w:ascii="Arial" w:cs="Arial" w:eastAsia="Arial" w:hAnsi="Arial"/>
@@ -18266,7 +18732,7 @@
             <w:pPr>
               <w:spacing w:after="20" w:before="0"/>
             </w:pPr>
-            <w:hyperlink w:history="1" r:id="rIdwvqyj_cmsmqsiej-t2yvw">
+            <w:hyperlink w:history="1" r:id="rIdq9h1301fh8bcnr7i6gyxw">
               <w:r>
                 <w:rPr>
                   <w:rFonts w:ascii="Arial" w:cs="Arial" w:eastAsia="Arial" w:hAnsi="Arial"/>
@@ -18299,7 +18765,7 @@
               <w:spacing w:after="10" w:before="0"/>
               <w:ind w:left="120"/>
             </w:pPr>
-            <w:hyperlink w:history="1" r:id="rId5frziiarrcepnwmelkiwb">
+            <w:hyperlink w:history="1" r:id="rIduytbbi7vhsvjqcicwpndv">
               <w:r>
                 <w:rPr>
                   <w:rFonts w:ascii="Arial" w:cs="Arial" w:eastAsia="Arial" w:hAnsi="Arial"/>
@@ -18344,7 +18810,7 @@
             <w:pPr>
               <w:spacing w:after="20" w:before="0"/>
             </w:pPr>
-            <w:hyperlink w:history="1" r:id="rIdrvuqmwrovr6vtfvnvb70v">
+            <w:hyperlink w:history="1" r:id="rIdawytudjul8u41y2nc-eym">
               <w:r>
                 <w:rPr>
                   <w:rFonts w:ascii="Arial" w:cs="Arial" w:eastAsia="Arial" w:hAnsi="Arial"/>
@@ -18377,7 +18843,7 @@
               <w:spacing w:after="10" w:before="0"/>
               <w:ind w:left="120"/>
             </w:pPr>
-            <w:hyperlink w:history="1" r:id="rId-nhnnqpf0d6mvlbwhbl6v">
+            <w:hyperlink w:history="1" r:id="rIdfkhavynnw0ykb3ymfppha">
               <w:r>
                 <w:rPr>
                   <w:rFonts w:ascii="Arial" w:cs="Arial" w:eastAsia="Arial" w:hAnsi="Arial"/>
@@ -18572,7 +19038,7 @@
             <w:pPr>
               <w:spacing w:after="20" w:before="0"/>
             </w:pPr>
-            <w:hyperlink w:history="1" r:id="rIdpcwku8_pibqi5klixey4v">
+            <w:hyperlink w:history="1" r:id="rIddd9t12ks0llr-jppn5ljg">
               <w:r>
                 <w:rPr>
                   <w:rFonts w:ascii="Arial" w:cs="Arial" w:eastAsia="Arial" w:hAnsi="Arial"/>
@@ -18605,7 +19071,7 @@
               <w:spacing w:after="10" w:before="0"/>
               <w:ind w:left="120"/>
             </w:pPr>
-            <w:hyperlink w:history="1" r:id="rIdrhautuxpyqtabme7lskz1">
+            <w:hyperlink w:history="1" r:id="rIdrbvym_wro-_cccjczrsc7">
               <w:r>
                 <w:rPr>
                   <w:rFonts w:ascii="Arial" w:cs="Arial" w:eastAsia="Arial" w:hAnsi="Arial"/>
@@ -18650,7 +19116,7 @@
             <w:pPr>
               <w:spacing w:after="20" w:before="0"/>
             </w:pPr>
-            <w:hyperlink w:history="1" r:id="rIdfmhio0dwp38yg1kwhevax">
+            <w:hyperlink w:history="1" r:id="rIdfprl5a3urybyovsqwixqe">
               <w:r>
                 <w:rPr>
                   <w:rFonts w:ascii="Arial" w:cs="Arial" w:eastAsia="Arial" w:hAnsi="Arial"/>
@@ -18683,7 +19149,7 @@
               <w:spacing w:after="10" w:before="0"/>
               <w:ind w:left="120"/>
             </w:pPr>
-            <w:hyperlink w:history="1" r:id="rIdjhbi6vs9rep4crwgxqhit">
+            <w:hyperlink w:history="1" r:id="rId9otqnprwznthmj0esfb9-">
               <w:r>
                 <w:rPr>
                   <w:rFonts w:ascii="Arial" w:cs="Arial" w:eastAsia="Arial" w:hAnsi="Arial"/>
@@ -18878,7 +19344,7 @@
             <w:pPr>
               <w:spacing w:after="20" w:before="0"/>
             </w:pPr>
-            <w:hyperlink w:history="1" r:id="rIdaz7nwewrxkdptj19gk1-b">
+            <w:hyperlink w:history="1" r:id="rIdyswr-a3bfjl2-fwr0n1mz">
               <w:r>
                 <w:rPr>
                   <w:rFonts w:ascii="Arial" w:cs="Arial" w:eastAsia="Arial" w:hAnsi="Arial"/>
@@ -18911,7 +19377,7 @@
               <w:spacing w:after="10" w:before="0"/>
               <w:ind w:left="120"/>
             </w:pPr>
-            <w:hyperlink w:history="1" r:id="rIdjhv8batjihrjddab9pbiw">
+            <w:hyperlink w:history="1" r:id="rIdosphzbv1v3gckqyrnycwp">
               <w:r>
                 <w:rPr>
                   <w:rFonts w:ascii="Arial" w:cs="Arial" w:eastAsia="Arial" w:hAnsi="Arial"/>
@@ -18956,7 +19422,7 @@
             <w:pPr>
               <w:spacing w:after="20" w:before="0"/>
             </w:pPr>
-            <w:hyperlink w:history="1" r:id="rIdi4jtvfblkbb0idpjbieqc">
+            <w:hyperlink w:history="1" r:id="rId3h2w_k182ob3-vlqsyvm5">
               <w:r>
                 <w:rPr>
                   <w:rFonts w:ascii="Arial" w:cs="Arial" w:eastAsia="Arial" w:hAnsi="Arial"/>
@@ -18989,7 +19455,7 @@
               <w:spacing w:after="10" w:before="0"/>
               <w:ind w:left="120"/>
             </w:pPr>
-            <w:hyperlink w:history="1" r:id="rId9ybamy3pl3gclsau3c0sv">
+            <w:hyperlink w:history="1" r:id="rIdsmokdw-n_ux08htmfxtwm">
               <w:r>
                 <w:rPr>
                   <w:rFonts w:ascii="Arial" w:cs="Arial" w:eastAsia="Arial" w:hAnsi="Arial"/>
@@ -19485,6 +19951,65 @@
         </w:tc>
       </w:tr>
     </w:tbl>
+    <w:p>
+      <w:pPr>
+        <w:pBdr>
+          <w:top w:val="single" w:color="BBBBBB" w:sz="4" w:space="4"/>
+        </w:pBdr>
+        <w:spacing w:after="0" w:before="160"/>
+      </w:pPr>
+      <w:r>
+        <w:rPr>
+          <w:rFonts w:ascii="Arial" w:cs="Arial" w:eastAsia="Arial" w:hAnsi="Arial"/>
+          <w:color w:val="666666"/>
+          <w:sz w:val="14"/>
+          <w:szCs w:val="14"/>
+        </w:rPr>
+        <w:t xml:space="preserve">© 2026 SeaVuria and ARES. Aligned with KICD objectives. Developed by SeaVuria; technical implementation by ARES (with AI assistance from Claude). Licensed under </w:t>
+      </w:r>
+      <w:hyperlink w:history="1" r:id="rIducmj8xtkl1xzdbpcjatkx">
+        <w:r>
+          <w:rPr>
+            <w:rFonts w:ascii="Arial" w:cs="Arial" w:eastAsia="Arial" w:hAnsi="Arial"/>
+            <w:color w:val="1F6B75"/>
+            <w:sz w:val="14"/>
+            <w:szCs w:val="14"/>
+            <w:u w:val="single" w:color="1F6B75"/>
+          </w:rPr>
+          <w:t xml:space="preserve">CC BY-NC 4.0</w:t>
+        </w:r>
+      </w:hyperlink>
+      <w:r>
+        <w:rPr>
+          <w:rFonts w:ascii="Arial" w:cs="Arial" w:eastAsia="Arial" w:hAnsi="Arial"/>
+          <w:color w:val="666666"/>
+          <w:sz w:val="14"/>
+          <w:szCs w:val="14"/>
+        </w:rPr>
+        <w:t xml:space="preserve"> (</w:t>
+      </w:r>
+      <w:hyperlink w:history="1" r:id="rIdlcrruftavbygw-davp7z6">
+        <w:r>
+          <w:rPr>
+            <w:rFonts w:ascii="Arial" w:cs="Arial" w:eastAsia="Arial" w:hAnsi="Arial"/>
+            <w:color w:val="1F6B75"/>
+            <w:sz w:val="14"/>
+            <w:szCs w:val="14"/>
+            <w:u w:val="single" w:color="1F6B75"/>
+          </w:rPr>
+          <w:t xml:space="preserve">https://creativecommons.org/licenses/by-nc/4.0/</w:t>
+        </w:r>
+      </w:hyperlink>
+      <w:r>
+        <w:rPr>
+          <w:rFonts w:ascii="Arial" w:cs="Arial" w:eastAsia="Arial" w:hAnsi="Arial"/>
+          <w:color w:val="666666"/>
+          <w:sz w:val="14"/>
+          <w:szCs w:val="14"/>
+        </w:rPr>
+        <w:t xml:space="preserve">).</w:t>
+      </w:r>
+    </w:p>
     <w:p>
       <w:r>
         <w:br w:type="page"/>
@@ -20477,7 +21002,7 @@
             <w:pPr>
               <w:spacing w:after="20" w:before="0"/>
             </w:pPr>
-            <w:hyperlink w:history="1" r:id="rIdbgqfasewfxs65ex61uuej">
+            <w:hyperlink w:history="1" r:id="rIditm8-plbmna6-8u_6xwoy">
               <w:r>
                 <w:rPr>
                   <w:rFonts w:ascii="Arial" w:cs="Arial" w:eastAsia="Arial" w:hAnsi="Arial"/>
@@ -20510,7 +21035,7 @@
               <w:spacing w:after="10" w:before="0"/>
               <w:ind w:left="120"/>
             </w:pPr>
-            <w:hyperlink w:history="1" r:id="rIdzq324cmc1xr0ugieq3s6r">
+            <w:hyperlink w:history="1" r:id="rIduz7nnt07yzq8e4vuwf23r">
               <w:r>
                 <w:rPr>
                   <w:rFonts w:ascii="Arial" w:cs="Arial" w:eastAsia="Arial" w:hAnsi="Arial"/>
@@ -20555,7 +21080,7 @@
             <w:pPr>
               <w:spacing w:after="20" w:before="0"/>
             </w:pPr>
-            <w:hyperlink w:history="1" r:id="rIdxnfydwrwcvirweg9uxb73">
+            <w:hyperlink w:history="1" r:id="rIdkvbgvorcxgl5uxq90dbcr">
               <w:r>
                 <w:rPr>
                   <w:rFonts w:ascii="Arial" w:cs="Arial" w:eastAsia="Arial" w:hAnsi="Arial"/>
@@ -20588,7 +21113,7 @@
               <w:spacing w:after="10" w:before="0"/>
               <w:ind w:left="120"/>
             </w:pPr>
-            <w:hyperlink w:history="1" r:id="rIdtxg_imyxqocxv73_wljtv">
+            <w:hyperlink w:history="1" r:id="rId6a6ieklrejqexqsd7sbgd">
               <w:r>
                 <w:rPr>
                   <w:rFonts w:ascii="Arial" w:cs="Arial" w:eastAsia="Arial" w:hAnsi="Arial"/>
@@ -20859,7 +21384,7 @@
             <w:pPr>
               <w:spacing w:after="20" w:before="0"/>
             </w:pPr>
-            <w:hyperlink w:history="1" r:id="rIdrxgsx3f-cvwkhvgkofa0z">
+            <w:hyperlink w:history="1" r:id="rIdvxpmixkbowzxddhmw-ist">
               <w:r>
                 <w:rPr>
                   <w:rFonts w:ascii="Arial" w:cs="Arial" w:eastAsia="Arial" w:hAnsi="Arial"/>
@@ -20892,7 +21417,7 @@
               <w:spacing w:after="10" w:before="0"/>
               <w:ind w:left="120"/>
             </w:pPr>
-            <w:hyperlink w:history="1" r:id="rIdmm46ob_4xn28msqnigbdy">
+            <w:hyperlink w:history="1" r:id="rId7djq8pjbgnmgpnjxdcjti">
               <w:r>
                 <w:rPr>
                   <w:rFonts w:ascii="Arial" w:cs="Arial" w:eastAsia="Arial" w:hAnsi="Arial"/>
@@ -20937,7 +21462,7 @@
             <w:pPr>
               <w:spacing w:after="20" w:before="0"/>
             </w:pPr>
-            <w:hyperlink w:history="1" r:id="rId0ybafdufi17tbjadcqpa0">
+            <w:hyperlink w:history="1" r:id="rIdab2kaactztp2vaakdbvae">
               <w:r>
                 <w:rPr>
                   <w:rFonts w:ascii="Arial" w:cs="Arial" w:eastAsia="Arial" w:hAnsi="Arial"/>
@@ -20970,7 +21495,7 @@
               <w:spacing w:after="10" w:before="0"/>
               <w:ind w:left="120"/>
             </w:pPr>
-            <w:hyperlink w:history="1" r:id="rIddezpidzmoml5uouimyhqa">
+            <w:hyperlink w:history="1" r:id="rIdumfr2_1le8duunijesg1l">
               <w:r>
                 <w:rPr>
                   <w:rFonts w:ascii="Arial" w:cs="Arial" w:eastAsia="Arial" w:hAnsi="Arial"/>
@@ -21469,7 +21994,7 @@
             <w:pPr>
               <w:spacing w:after="20" w:before="0"/>
             </w:pPr>
-            <w:hyperlink w:history="1" r:id="rId6anojxvukxlcmw-j5ywdg">
+            <w:hyperlink w:history="1" r:id="rIdgwr1oy5_fnskqsyeaytxp">
               <w:r>
                 <w:rPr>
                   <w:rFonts w:ascii="Arial" w:cs="Arial" w:eastAsia="Arial" w:hAnsi="Arial"/>
@@ -21502,7 +22027,7 @@
               <w:spacing w:after="10" w:before="0"/>
               <w:ind w:left="120"/>
             </w:pPr>
-            <w:hyperlink w:history="1" r:id="rId4v81t4xldqgmhheektnbo">
+            <w:hyperlink w:history="1" r:id="rIduyuzdf3yl97ikcq3mrqep">
               <w:r>
                 <w:rPr>
                   <w:rFonts w:ascii="Arial" w:cs="Arial" w:eastAsia="Arial" w:hAnsi="Arial"/>
@@ -21547,7 +22072,7 @@
             <w:pPr>
               <w:spacing w:after="20" w:before="0"/>
             </w:pPr>
-            <w:hyperlink w:history="1" r:id="rIdorugh5sd0tbkahjob943s">
+            <w:hyperlink w:history="1" r:id="rIdnood4uxjqt4zcuqyokh6s">
               <w:r>
                 <w:rPr>
                   <w:rFonts w:ascii="Arial" w:cs="Arial" w:eastAsia="Arial" w:hAnsi="Arial"/>
@@ -21580,7 +22105,7 @@
               <w:spacing w:after="10" w:before="0"/>
               <w:ind w:left="120"/>
             </w:pPr>
-            <w:hyperlink w:history="1" r:id="rIde3xdn70ewk8xcpeva9azd">
+            <w:hyperlink w:history="1" r:id="rIdwzezlppp-_zbtcpzmr5na">
               <w:r>
                 <w:rPr>
                   <w:rFonts w:ascii="Arial" w:cs="Arial" w:eastAsia="Arial" w:hAnsi="Arial"/>
@@ -21851,7 +22376,7 @@
             <w:pPr>
               <w:spacing w:after="20" w:before="0"/>
             </w:pPr>
-            <w:hyperlink w:history="1" r:id="rIdnplv1puaqn6yxsp7-qrxl">
+            <w:hyperlink w:history="1" r:id="rId1ujfovocjq9rtxk1b3vea">
               <w:r>
                 <w:rPr>
                   <w:rFonts w:ascii="Arial" w:cs="Arial" w:eastAsia="Arial" w:hAnsi="Arial"/>
@@ -21884,7 +22409,7 @@
               <w:spacing w:after="10" w:before="0"/>
               <w:ind w:left="120"/>
             </w:pPr>
-            <w:hyperlink w:history="1" r:id="rId5db0g0ywokqudb-ht1xtl">
+            <w:hyperlink w:history="1" r:id="rIduohxovmjfoxlq5fsgn0kz">
               <w:r>
                 <w:rPr>
                   <w:rFonts w:ascii="Arial" w:cs="Arial" w:eastAsia="Arial" w:hAnsi="Arial"/>
@@ -21929,7 +22454,7 @@
             <w:pPr>
               <w:spacing w:after="20" w:before="0"/>
             </w:pPr>
-            <w:hyperlink w:history="1" r:id="rId7tuaecmfgx9d0daesjesv">
+            <w:hyperlink w:history="1" r:id="rIduvr5rqnwqoshucl-et5rp">
               <w:r>
                 <w:rPr>
                   <w:rFonts w:ascii="Arial" w:cs="Arial" w:eastAsia="Arial" w:hAnsi="Arial"/>
@@ -21962,7 +22487,7 @@
               <w:spacing w:after="10" w:before="0"/>
               <w:ind w:left="120"/>
             </w:pPr>
-            <w:hyperlink w:history="1" r:id="rIddqpam4dubb0w3d6qmeucx">
+            <w:hyperlink w:history="1" r:id="rIdpbwecmjpmbdtrr7cwhtzw">
               <w:r>
                 <w:rPr>
                   <w:rFonts w:ascii="Arial" w:cs="Arial" w:eastAsia="Arial" w:hAnsi="Arial"/>
@@ -22233,7 +22758,7 @@
             <w:pPr>
               <w:spacing w:after="20" w:before="0"/>
             </w:pPr>
-            <w:hyperlink w:history="1" r:id="rId0-btgnnzdhvcjivf_4u-d">
+            <w:hyperlink w:history="1" r:id="rIdm9yfizmw2l5vieezlrpk1">
               <w:r>
                 <w:rPr>
                   <w:rFonts w:ascii="Arial" w:cs="Arial" w:eastAsia="Arial" w:hAnsi="Arial"/>
@@ -22266,7 +22791,7 @@
               <w:spacing w:after="10" w:before="0"/>
               <w:ind w:left="120"/>
             </w:pPr>
-            <w:hyperlink w:history="1" r:id="rIdkyhyisbl240mch72lznus">
+            <w:hyperlink w:history="1" r:id="rIdmuuigc_0zcjdzbyqpbqan">
               <w:r>
                 <w:rPr>
                   <w:rFonts w:ascii="Arial" w:cs="Arial" w:eastAsia="Arial" w:hAnsi="Arial"/>
@@ -22311,7 +22836,7 @@
             <w:pPr>
               <w:spacing w:after="20" w:before="0"/>
             </w:pPr>
-            <w:hyperlink w:history="1" r:id="rIdwg6s0opfbmfejl9g_ja5t">
+            <w:hyperlink w:history="1" r:id="rIdgtipa1gvvkf-rsttowby4">
               <w:r>
                 <w:rPr>
                   <w:rFonts w:ascii="Arial" w:cs="Arial" w:eastAsia="Arial" w:hAnsi="Arial"/>
@@ -22344,7 +22869,7 @@
               <w:spacing w:after="10" w:before="0"/>
               <w:ind w:left="120"/>
             </w:pPr>
-            <w:hyperlink w:history="1" r:id="rIdsvexr3v2kxbhi8iy2hlfa">
+            <w:hyperlink w:history="1" r:id="rIdhcv_7xrxk23icbbugf9qu">
               <w:r>
                 <w:rPr>
                   <w:rFonts w:ascii="Arial" w:cs="Arial" w:eastAsia="Arial" w:hAnsi="Arial"/>
@@ -22954,6 +23479,65 @@
         </w:tc>
       </w:tr>
     </w:tbl>
+    <w:p>
+      <w:pPr>
+        <w:pBdr>
+          <w:top w:val="single" w:color="BBBBBB" w:sz="4" w:space="4"/>
+        </w:pBdr>
+        <w:spacing w:after="0" w:before="160"/>
+      </w:pPr>
+      <w:r>
+        <w:rPr>
+          <w:rFonts w:ascii="Arial" w:cs="Arial" w:eastAsia="Arial" w:hAnsi="Arial"/>
+          <w:color w:val="666666"/>
+          <w:sz w:val="14"/>
+          <w:szCs w:val="14"/>
+        </w:rPr>
+        <w:t xml:space="preserve">© 2026 SeaVuria and ARES. Aligned with KICD objectives. Developed by SeaVuria; technical implementation by ARES (with AI assistance from Claude). Licensed under </w:t>
+      </w:r>
+      <w:hyperlink w:history="1" r:id="rIdvxs9xuadr_195j1iyk6a1">
+        <w:r>
+          <w:rPr>
+            <w:rFonts w:ascii="Arial" w:cs="Arial" w:eastAsia="Arial" w:hAnsi="Arial"/>
+            <w:color w:val="1F6B75"/>
+            <w:sz w:val="14"/>
+            <w:szCs w:val="14"/>
+            <w:u w:val="single" w:color="1F6B75"/>
+          </w:rPr>
+          <w:t xml:space="preserve">CC BY-NC 4.0</w:t>
+        </w:r>
+      </w:hyperlink>
+      <w:r>
+        <w:rPr>
+          <w:rFonts w:ascii="Arial" w:cs="Arial" w:eastAsia="Arial" w:hAnsi="Arial"/>
+          <w:color w:val="666666"/>
+          <w:sz w:val="14"/>
+          <w:szCs w:val="14"/>
+        </w:rPr>
+        <w:t xml:space="preserve"> (</w:t>
+      </w:r>
+      <w:hyperlink w:history="1" r:id="rIdtb-ebz88dfzgvhhwzc3kc">
+        <w:r>
+          <w:rPr>
+            <w:rFonts w:ascii="Arial" w:cs="Arial" w:eastAsia="Arial" w:hAnsi="Arial"/>
+            <w:color w:val="1F6B75"/>
+            <w:sz w:val="14"/>
+            <w:szCs w:val="14"/>
+            <w:u w:val="single" w:color="1F6B75"/>
+          </w:rPr>
+          <w:t xml:space="preserve">https://creativecommons.org/licenses/by-nc/4.0/</w:t>
+        </w:r>
+      </w:hyperlink>
+      <w:r>
+        <w:rPr>
+          <w:rFonts w:ascii="Arial" w:cs="Arial" w:eastAsia="Arial" w:hAnsi="Arial"/>
+          <w:color w:val="666666"/>
+          <w:sz w:val="14"/>
+          <w:szCs w:val="14"/>
+        </w:rPr>
+        <w:t xml:space="preserve">).</w:t>
+      </w:r>
+    </w:p>
     <w:p>
       <w:r>
         <w:br w:type="page"/>
@@ -23945,7 +24529,7 @@
             <w:pPr>
               <w:spacing w:after="20" w:before="0"/>
             </w:pPr>
-            <w:hyperlink w:history="1" r:id="rIdsajxp5irvvlcsgyjzikd6">
+            <w:hyperlink w:history="1" r:id="rIddzyazpsajtjcfdgws_qoy">
               <w:r>
                 <w:rPr>
                   <w:rFonts w:ascii="Arial" w:cs="Arial" w:eastAsia="Arial" w:hAnsi="Arial"/>
@@ -23978,7 +24562,7 @@
               <w:spacing w:after="10" w:before="0"/>
               <w:ind w:left="120"/>
             </w:pPr>
-            <w:hyperlink w:history="1" r:id="rIddoh6bdelvy2ifbs3b3hqj">
+            <w:hyperlink w:history="1" r:id="rIdgg2wnzaeih5mghsk1rfv4">
               <w:r>
                 <w:rPr>
                   <w:rFonts w:ascii="Arial" w:cs="Arial" w:eastAsia="Arial" w:hAnsi="Arial"/>
@@ -24023,7 +24607,7 @@
             <w:pPr>
               <w:spacing w:after="20" w:before="0"/>
             </w:pPr>
-            <w:hyperlink w:history="1" r:id="rId3eydbkdhu9nduvxxkau2-">
+            <w:hyperlink w:history="1" r:id="rIdcjfooxjw-i_jwwyb3f1d4">
               <w:r>
                 <w:rPr>
                   <w:rFonts w:ascii="Arial" w:cs="Arial" w:eastAsia="Arial" w:hAnsi="Arial"/>
@@ -24056,7 +24640,7 @@
               <w:spacing w:after="10" w:before="0"/>
               <w:ind w:left="120"/>
             </w:pPr>
-            <w:hyperlink w:history="1" r:id="rIdyw1mefx38yrtg_n8svglm">
+            <w:hyperlink w:history="1" r:id="rId-r1paixldtn7ikaduqatk">
               <w:r>
                 <w:rPr>
                   <w:rFonts w:ascii="Arial" w:cs="Arial" w:eastAsia="Arial" w:hAnsi="Arial"/>
@@ -24251,7 +24835,7 @@
             <w:pPr>
               <w:spacing w:after="20" w:before="0"/>
             </w:pPr>
-            <w:hyperlink w:history="1" r:id="rId7hjgw41qgljd5j90rzqwh">
+            <w:hyperlink w:history="1" r:id="rIdmvy78kvosyf663iwea0at">
               <w:r>
                 <w:rPr>
                   <w:rFonts w:ascii="Arial" w:cs="Arial" w:eastAsia="Arial" w:hAnsi="Arial"/>
@@ -24284,7 +24868,7 @@
               <w:spacing w:after="10" w:before="0"/>
               <w:ind w:left="120"/>
             </w:pPr>
-            <w:hyperlink w:history="1" r:id="rIduoxp-hlmlcboo0ikwexo5">
+            <w:hyperlink w:history="1" r:id="rIdqqjrdgp_d3qtkqk4daesg">
               <w:r>
                 <w:rPr>
                   <w:rFonts w:ascii="Arial" w:cs="Arial" w:eastAsia="Arial" w:hAnsi="Arial"/>
@@ -24329,7 +24913,7 @@
             <w:pPr>
               <w:spacing w:after="20" w:before="0"/>
             </w:pPr>
-            <w:hyperlink w:history="1" r:id="rIdsvsoyi_ewoomjhqscxto7">
+            <w:hyperlink w:history="1" r:id="rIdysvb_lxjmvghu2cdaxx_g">
               <w:r>
                 <w:rPr>
                   <w:rFonts w:ascii="Arial" w:cs="Arial" w:eastAsia="Arial" w:hAnsi="Arial"/>
@@ -24362,7 +24946,7 @@
               <w:spacing w:after="10" w:before="0"/>
               <w:ind w:left="120"/>
             </w:pPr>
-            <w:hyperlink w:history="1" r:id="rIdeuwqbjtrogllwoytyx2rs">
+            <w:hyperlink w:history="1" r:id="rIdkdcyydgrlabn-lstjw29b">
               <w:r>
                 <w:rPr>
                   <w:rFonts w:ascii="Arial" w:cs="Arial" w:eastAsia="Arial" w:hAnsi="Arial"/>
@@ -24557,7 +25141,7 @@
             <w:pPr>
               <w:spacing w:after="20" w:before="0"/>
             </w:pPr>
-            <w:hyperlink w:history="1" r:id="rIdrutrzfrm95u5uhz_bcrpq">
+            <w:hyperlink w:history="1" r:id="rIdbxryk2vuuz0e3vgx9fyo-">
               <w:r>
                 <w:rPr>
                   <w:rFonts w:ascii="Arial" w:cs="Arial" w:eastAsia="Arial" w:hAnsi="Arial"/>
@@ -24590,7 +25174,7 @@
               <w:spacing w:after="10" w:before="0"/>
               <w:ind w:left="120"/>
             </w:pPr>
-            <w:hyperlink w:history="1" r:id="rId0yp_og9abftuj1dkyagvk">
+            <w:hyperlink w:history="1" r:id="rIddfxypwliq7kmxpewwawm_">
               <w:r>
                 <w:rPr>
                   <w:rFonts w:ascii="Arial" w:cs="Arial" w:eastAsia="Arial" w:hAnsi="Arial"/>
@@ -24635,7 +25219,7 @@
             <w:pPr>
               <w:spacing w:after="20" w:before="0"/>
             </w:pPr>
-            <w:hyperlink w:history="1" r:id="rIdgbg7qco3czgceipfoepek">
+            <w:hyperlink w:history="1" r:id="rIdbw62hqfmzfc37qjtexepq">
               <w:r>
                 <w:rPr>
                   <w:rFonts w:ascii="Arial" w:cs="Arial" w:eastAsia="Arial" w:hAnsi="Arial"/>
@@ -24668,7 +25252,7 @@
               <w:spacing w:after="10" w:before="0"/>
               <w:ind w:left="120"/>
             </w:pPr>
-            <w:hyperlink w:history="1" r:id="rIdb6vnfa2qjr0thvdevje0z">
+            <w:hyperlink w:history="1" r:id="rIdhjmvj_5uyqzhvdggohje8">
               <w:r>
                 <w:rPr>
                   <w:rFonts w:ascii="Arial" w:cs="Arial" w:eastAsia="Arial" w:hAnsi="Arial"/>
@@ -24863,7 +25447,7 @@
             <w:pPr>
               <w:spacing w:after="20" w:before="0"/>
             </w:pPr>
-            <w:hyperlink w:history="1" r:id="rIddvqwd0smhr1kbhvpirlbo">
+            <w:hyperlink w:history="1" r:id="rIdpoheapzzpmyyverinare9">
               <w:r>
                 <w:rPr>
                   <w:rFonts w:ascii="Arial" w:cs="Arial" w:eastAsia="Arial" w:hAnsi="Arial"/>
@@ -24896,7 +25480,7 @@
               <w:spacing w:after="10" w:before="0"/>
               <w:ind w:left="120"/>
             </w:pPr>
-            <w:hyperlink w:history="1" r:id="rIdeo91lqoltm8f_uk42l4mf">
+            <w:hyperlink w:history="1" r:id="rId2i8zsr93wptob2cmld_1l">
               <w:r>
                 <w:rPr>
                   <w:rFonts w:ascii="Arial" w:cs="Arial" w:eastAsia="Arial" w:hAnsi="Arial"/>
@@ -24941,7 +25525,7 @@
             <w:pPr>
               <w:spacing w:after="20" w:before="0"/>
             </w:pPr>
-            <w:hyperlink w:history="1" r:id="rIdzqsfe-pobctboujgqjg1u">
+            <w:hyperlink w:history="1" r:id="rIdgteafegelszhcct3jdzmv">
               <w:r>
                 <w:rPr>
                   <w:rFonts w:ascii="Arial" w:cs="Arial" w:eastAsia="Arial" w:hAnsi="Arial"/>
@@ -24974,7 +25558,7 @@
               <w:spacing w:after="10" w:before="0"/>
               <w:ind w:left="120"/>
             </w:pPr>
-            <w:hyperlink w:history="1" r:id="rIdtrptunqzky3pbbuydsqel">
+            <w:hyperlink w:history="1" r:id="rIds_ezxvgaeycd-3wpstjtr">
               <w:r>
                 <w:rPr>
                   <w:rFonts w:ascii="Arial" w:cs="Arial" w:eastAsia="Arial" w:hAnsi="Arial"/>
@@ -25169,7 +25753,7 @@
             <w:pPr>
               <w:spacing w:after="20" w:before="0"/>
             </w:pPr>
-            <w:hyperlink w:history="1" r:id="rIdgb-boc_obvkeavvd4bvhk">
+            <w:hyperlink w:history="1" r:id="rId12cs3bmyfmviv-g7jhn45">
               <w:r>
                 <w:rPr>
                   <w:rFonts w:ascii="Arial" w:cs="Arial" w:eastAsia="Arial" w:hAnsi="Arial"/>
@@ -25202,7 +25786,7 @@
               <w:spacing w:after="10" w:before="0"/>
               <w:ind w:left="120"/>
             </w:pPr>
-            <w:hyperlink w:history="1" r:id="rIdv5vgimttg23entfv5dyq3">
+            <w:hyperlink w:history="1" r:id="rId8oum02cg5b7olrrcw4ine">
               <w:r>
                 <w:rPr>
                   <w:rFonts w:ascii="Arial" w:cs="Arial" w:eastAsia="Arial" w:hAnsi="Arial"/>
@@ -25247,7 +25831,7 @@
             <w:pPr>
               <w:spacing w:after="20" w:before="0"/>
             </w:pPr>
-            <w:hyperlink w:history="1" r:id="rIdfdhb6oed4iuri4p1srd13">
+            <w:hyperlink w:history="1" r:id="rIdkwlqn19a00uy03-sqdwf4">
               <w:r>
                 <w:rPr>
                   <w:rFonts w:ascii="Arial" w:cs="Arial" w:eastAsia="Arial" w:hAnsi="Arial"/>
@@ -25280,7 +25864,7 @@
               <w:spacing w:after="10" w:before="0"/>
               <w:ind w:left="120"/>
             </w:pPr>
-            <w:hyperlink w:history="1" r:id="rIddauf2rxxupwc9wlfzkmak">
+            <w:hyperlink w:history="1" r:id="rIdm8g0b0wp6wdablkl6i8k2">
               <w:r>
                 <w:rPr>
                   <w:rFonts w:ascii="Arial" w:cs="Arial" w:eastAsia="Arial" w:hAnsi="Arial"/>
@@ -25776,6 +26360,65 @@
         </w:tc>
       </w:tr>
     </w:tbl>
+    <w:p>
+      <w:pPr>
+        <w:pBdr>
+          <w:top w:val="single" w:color="BBBBBB" w:sz="4" w:space="4"/>
+        </w:pBdr>
+        <w:spacing w:after="0" w:before="160"/>
+      </w:pPr>
+      <w:r>
+        <w:rPr>
+          <w:rFonts w:ascii="Arial" w:cs="Arial" w:eastAsia="Arial" w:hAnsi="Arial"/>
+          <w:color w:val="666666"/>
+          <w:sz w:val="14"/>
+          <w:szCs w:val="14"/>
+        </w:rPr>
+        <w:t xml:space="preserve">© 2026 SeaVuria and ARES. Aligned with KICD objectives. Developed by SeaVuria; technical implementation by ARES (with AI assistance from Claude). Licensed under </w:t>
+      </w:r>
+      <w:hyperlink w:history="1" r:id="rIds1jk9riwu8zjbtk_s8tnm">
+        <w:r>
+          <w:rPr>
+            <w:rFonts w:ascii="Arial" w:cs="Arial" w:eastAsia="Arial" w:hAnsi="Arial"/>
+            <w:color w:val="1F6B75"/>
+            <w:sz w:val="14"/>
+            <w:szCs w:val="14"/>
+            <w:u w:val="single" w:color="1F6B75"/>
+          </w:rPr>
+          <w:t xml:space="preserve">CC BY-NC 4.0</w:t>
+        </w:r>
+      </w:hyperlink>
+      <w:r>
+        <w:rPr>
+          <w:rFonts w:ascii="Arial" w:cs="Arial" w:eastAsia="Arial" w:hAnsi="Arial"/>
+          <w:color w:val="666666"/>
+          <w:sz w:val="14"/>
+          <w:szCs w:val="14"/>
+        </w:rPr>
+        <w:t xml:space="preserve"> (</w:t>
+      </w:r>
+      <w:hyperlink w:history="1" r:id="rIdm_hdtlmuwmky1i2umbutl">
+        <w:r>
+          <w:rPr>
+            <w:rFonts w:ascii="Arial" w:cs="Arial" w:eastAsia="Arial" w:hAnsi="Arial"/>
+            <w:color w:val="1F6B75"/>
+            <w:sz w:val="14"/>
+            <w:szCs w:val="14"/>
+            <w:u w:val="single" w:color="1F6B75"/>
+          </w:rPr>
+          <w:t xml:space="preserve">https://creativecommons.org/licenses/by-nc/4.0/</w:t>
+        </w:r>
+      </w:hyperlink>
+      <w:r>
+        <w:rPr>
+          <w:rFonts w:ascii="Arial" w:cs="Arial" w:eastAsia="Arial" w:hAnsi="Arial"/>
+          <w:color w:val="666666"/>
+          <w:sz w:val="14"/>
+          <w:szCs w:val="14"/>
+        </w:rPr>
+        <w:t xml:space="preserve">).</w:t>
+      </w:r>
+    </w:p>
     <w:p>
       <w:r>
         <w:br w:type="page"/>
@@ -26784,7 +27427,7 @@
               <w:spacing w:after="10" w:before="0"/>
               <w:ind w:left="120"/>
             </w:pPr>
-            <w:hyperlink w:history="1" r:id="rIdshzkkytt0su8dghyt5chl">
+            <w:hyperlink w:history="1" r:id="rIdwalqpzvoj2jnc8l_7aqo0">
               <w:r>
                 <w:rPr>
                   <w:rFonts w:ascii="Arial" w:cs="Arial" w:eastAsia="Arial" w:hAnsi="Arial"/>
@@ -26861,7 +27504,7 @@
               <w:spacing w:after="10" w:before="0"/>
               <w:ind w:left="120"/>
             </w:pPr>
-            <w:hyperlink w:history="1" r:id="rIdoup7eofbpalzlxlo_4hvt">
+            <w:hyperlink w:history="1" r:id="rId0ndz9v7jnojrl4abx-dsd">
               <w:r>
                 <w:rPr>
                   <w:rFonts w:ascii="Arial" w:cs="Arial" w:eastAsia="Arial" w:hAnsi="Arial"/>
@@ -27088,7 +27731,7 @@
               <w:spacing w:after="10" w:before="0"/>
               <w:ind w:left="120"/>
             </w:pPr>
-            <w:hyperlink w:history="1" r:id="rIdubwxkbhvz5ijudgrvuh13">
+            <w:hyperlink w:history="1" r:id="rIdudmlftdtydb8geg4oyks3">
               <w:r>
                 <w:rPr>
                   <w:rFonts w:ascii="Arial" w:cs="Arial" w:eastAsia="Arial" w:hAnsi="Arial"/>
@@ -27165,7 +27808,7 @@
               <w:spacing w:after="10" w:before="0"/>
               <w:ind w:left="120"/>
             </w:pPr>
-            <w:hyperlink w:history="1" r:id="rId15puawyyexoq0i0hwaqbb">
+            <w:hyperlink w:history="1" r:id="rIdgghblyvjk3vxt_s10lncu">
               <w:r>
                 <w:rPr>
                   <w:rFonts w:ascii="Arial" w:cs="Arial" w:eastAsia="Arial" w:hAnsi="Arial"/>
@@ -27392,7 +28035,7 @@
               <w:spacing w:after="10" w:before="0"/>
               <w:ind w:left="120"/>
             </w:pPr>
-            <w:hyperlink w:history="1" r:id="rIdad7r6jivsdrluh_thl4cm">
+            <w:hyperlink w:history="1" r:id="rIdv7zcbljf6xgtvfbdlgvsg">
               <w:r>
                 <w:rPr>
                   <w:rFonts w:ascii="Arial" w:cs="Arial" w:eastAsia="Arial" w:hAnsi="Arial"/>
@@ -27469,7 +28112,7 @@
               <w:spacing w:after="10" w:before="0"/>
               <w:ind w:left="120"/>
             </w:pPr>
-            <w:hyperlink w:history="1" r:id="rId-rwommwm11-5qb2sermlg">
+            <w:hyperlink w:history="1" r:id="rIdqd6bvngufif4dzznjwbiw">
               <w:r>
                 <w:rPr>
                   <w:rFonts w:ascii="Arial" w:cs="Arial" w:eastAsia="Arial" w:hAnsi="Arial"/>
@@ -27696,7 +28339,7 @@
               <w:spacing w:after="10" w:before="0"/>
               <w:ind w:left="120"/>
             </w:pPr>
-            <w:hyperlink w:history="1" r:id="rIduc7hljpksaqzcxgiyhlkx">
+            <w:hyperlink w:history="1" r:id="rIdhfns-bnqyyscvpknnnreh">
               <w:r>
                 <w:rPr>
                   <w:rFonts w:ascii="Arial" w:cs="Arial" w:eastAsia="Arial" w:hAnsi="Arial"/>
@@ -27773,7 +28416,7 @@
               <w:spacing w:after="10" w:before="0"/>
               <w:ind w:left="120"/>
             </w:pPr>
-            <w:hyperlink w:history="1" r:id="rIdemxrhkdq5tnurarjw86pk">
+            <w:hyperlink w:history="1" r:id="rIdaboozawy8-lknpy7na1wr">
               <w:r>
                 <w:rPr>
                   <w:rFonts w:ascii="Arial" w:cs="Arial" w:eastAsia="Arial" w:hAnsi="Arial"/>
@@ -28000,7 +28643,7 @@
               <w:spacing w:after="10" w:before="0"/>
               <w:ind w:left="120"/>
             </w:pPr>
-            <w:hyperlink w:history="1" r:id="rId0tfhuwo2uitko3t5ickiz">
+            <w:hyperlink w:history="1" r:id="rId2jonazscnbhjp2-ukiw35">
               <w:r>
                 <w:rPr>
                   <w:rFonts w:ascii="Arial" w:cs="Arial" w:eastAsia="Arial" w:hAnsi="Arial"/>
@@ -28077,7 +28720,7 @@
               <w:spacing w:after="10" w:before="0"/>
               <w:ind w:left="120"/>
             </w:pPr>
-            <w:hyperlink w:history="1" r:id="rIdzcfwe55tccsl9zwauu5ez">
+            <w:hyperlink w:history="1" r:id="rIdc-mzg2ifrn2jzpnkcp5ih">
               <w:r>
                 <w:rPr>
                   <w:rFonts w:ascii="Arial" w:cs="Arial" w:eastAsia="Arial" w:hAnsi="Arial"/>
@@ -28588,6 +29231,65 @@
         </w:tc>
       </w:tr>
     </w:tbl>
+    <w:p>
+      <w:pPr>
+        <w:pBdr>
+          <w:top w:val="single" w:color="BBBBBB" w:sz="4" w:space="4"/>
+        </w:pBdr>
+        <w:spacing w:after="0" w:before="160"/>
+      </w:pPr>
+      <w:r>
+        <w:rPr>
+          <w:rFonts w:ascii="Arial" w:cs="Arial" w:eastAsia="Arial" w:hAnsi="Arial"/>
+          <w:color w:val="666666"/>
+          <w:sz w:val="14"/>
+          <w:szCs w:val="14"/>
+        </w:rPr>
+        <w:t xml:space="preserve">© 2026 SeaVuria and ARES. Aligned with KICD objectives. Developed by SeaVuria; technical implementation by ARES (with AI assistance from Claude). Licensed under </w:t>
+      </w:r>
+      <w:hyperlink w:history="1" r:id="rIdpqrbfpi7f3ld9bbjhcjky">
+        <w:r>
+          <w:rPr>
+            <w:rFonts w:ascii="Arial" w:cs="Arial" w:eastAsia="Arial" w:hAnsi="Arial"/>
+            <w:color w:val="1F6B75"/>
+            <w:sz w:val="14"/>
+            <w:szCs w:val="14"/>
+            <w:u w:val="single" w:color="1F6B75"/>
+          </w:rPr>
+          <w:t xml:space="preserve">CC BY-NC 4.0</w:t>
+        </w:r>
+      </w:hyperlink>
+      <w:r>
+        <w:rPr>
+          <w:rFonts w:ascii="Arial" w:cs="Arial" w:eastAsia="Arial" w:hAnsi="Arial"/>
+          <w:color w:val="666666"/>
+          <w:sz w:val="14"/>
+          <w:szCs w:val="14"/>
+        </w:rPr>
+        <w:t xml:space="preserve"> (</w:t>
+      </w:r>
+      <w:hyperlink w:history="1" r:id="rIdzeemyoyiefggcdwdgnrch">
+        <w:r>
+          <w:rPr>
+            <w:rFonts w:ascii="Arial" w:cs="Arial" w:eastAsia="Arial" w:hAnsi="Arial"/>
+            <w:color w:val="1F6B75"/>
+            <w:sz w:val="14"/>
+            <w:szCs w:val="14"/>
+            <w:u w:val="single" w:color="1F6B75"/>
+          </w:rPr>
+          <w:t xml:space="preserve">https://creativecommons.org/licenses/by-nc/4.0/</w:t>
+        </w:r>
+      </w:hyperlink>
+      <w:r>
+        <w:rPr>
+          <w:rFonts w:ascii="Arial" w:cs="Arial" w:eastAsia="Arial" w:hAnsi="Arial"/>
+          <w:color w:val="666666"/>
+          <w:sz w:val="14"/>
+          <w:szCs w:val="14"/>
+        </w:rPr>
+        <w:t xml:space="preserve">).</w:t>
+      </w:r>
+    </w:p>
     <w:p>
       <w:r>
         <w:br w:type="page"/>
@@ -29579,7 +30281,7 @@
             <w:pPr>
               <w:spacing w:after="20" w:before="0"/>
             </w:pPr>
-            <w:hyperlink w:history="1" r:id="rId-yn3rned7crgorqnpd8kl">
+            <w:hyperlink w:history="1" r:id="rIdeow4xazb9f0aetgmzubq4">
               <w:r>
                 <w:rPr>
                   <w:rFonts w:ascii="Arial" w:cs="Arial" w:eastAsia="Arial" w:hAnsi="Arial"/>
@@ -29612,7 +30314,7 @@
               <w:spacing w:after="10" w:before="0"/>
               <w:ind w:left="120"/>
             </w:pPr>
-            <w:hyperlink w:history="1" r:id="rId72iibxuhtzbbecvspexgc">
+            <w:hyperlink w:history="1" r:id="rId1ufbh5jiysx_zuv_wniel">
               <w:r>
                 <w:rPr>
                   <w:rFonts w:ascii="Arial" w:cs="Arial" w:eastAsia="Arial" w:hAnsi="Arial"/>
@@ -29657,7 +30359,7 @@
             <w:pPr>
               <w:spacing w:after="20" w:before="0"/>
             </w:pPr>
-            <w:hyperlink w:history="1" r:id="rIdq-swjwjzctox1pqaage4k">
+            <w:hyperlink w:history="1" r:id="rIdbw4chy3qu2gn8f1e-4-s7">
               <w:r>
                 <w:rPr>
                   <w:rFonts w:ascii="Arial" w:cs="Arial" w:eastAsia="Arial" w:hAnsi="Arial"/>
@@ -29690,7 +30392,7 @@
               <w:spacing w:after="10" w:before="0"/>
               <w:ind w:left="120"/>
             </w:pPr>
-            <w:hyperlink w:history="1" r:id="rIduuotiv6s3ulrbmosgc3mm">
+            <w:hyperlink w:history="1" r:id="rIdbofgg0sa-fmrmyzc9soay">
               <w:r>
                 <w:rPr>
                   <w:rFonts w:ascii="Arial" w:cs="Arial" w:eastAsia="Arial" w:hAnsi="Arial"/>
@@ -29885,7 +30587,7 @@
             <w:pPr>
               <w:spacing w:after="20" w:before="0"/>
             </w:pPr>
-            <w:hyperlink w:history="1" r:id="rIdduwdh1jlrzpuoa-95grtt">
+            <w:hyperlink w:history="1" r:id="rIdykxrr3-2jf0uxuv9-grxc">
               <w:r>
                 <w:rPr>
                   <w:rFonts w:ascii="Arial" w:cs="Arial" w:eastAsia="Arial" w:hAnsi="Arial"/>
@@ -29918,7 +30620,7 @@
               <w:spacing w:after="10" w:before="0"/>
               <w:ind w:left="120"/>
             </w:pPr>
-            <w:hyperlink w:history="1" r:id="rIdlqbqklxicprbytq7keiiw">
+            <w:hyperlink w:history="1" r:id="rIdnviuijf15agh5j51ziaxb">
               <w:r>
                 <w:rPr>
                   <w:rFonts w:ascii="Arial" w:cs="Arial" w:eastAsia="Arial" w:hAnsi="Arial"/>
@@ -29963,7 +30665,7 @@
             <w:pPr>
               <w:spacing w:after="20" w:before="0"/>
             </w:pPr>
-            <w:hyperlink w:history="1" r:id="rIdkbhpsmbezcrzg-ncatugk">
+            <w:hyperlink w:history="1" r:id="rId6yhdwx0ocm8orbebh28qh">
               <w:r>
                 <w:rPr>
                   <w:rFonts w:ascii="Arial" w:cs="Arial" w:eastAsia="Arial" w:hAnsi="Arial"/>
@@ -29996,7 +30698,7 @@
               <w:spacing w:after="10" w:before="0"/>
               <w:ind w:left="120"/>
             </w:pPr>
-            <w:hyperlink w:history="1" r:id="rId13bb6aooz3ad81d-ygemd">
+            <w:hyperlink w:history="1" r:id="rId3yrqdjzr7yvspsry7vudq">
               <w:r>
                 <w:rPr>
                   <w:rFonts w:ascii="Arial" w:cs="Arial" w:eastAsia="Arial" w:hAnsi="Arial"/>
@@ -30191,7 +30893,7 @@
             <w:pPr>
               <w:spacing w:after="20" w:before="0"/>
             </w:pPr>
-            <w:hyperlink w:history="1" r:id="rId6k8wi3ffsigbuwvi2ffs0">
+            <w:hyperlink w:history="1" r:id="rIdshqqiwaltff4w-t4shbzz">
               <w:r>
                 <w:rPr>
                   <w:rFonts w:ascii="Arial" w:cs="Arial" w:eastAsia="Arial" w:hAnsi="Arial"/>
@@ -30224,7 +30926,7 @@
               <w:spacing w:after="10" w:before="0"/>
               <w:ind w:left="120"/>
             </w:pPr>
-            <w:hyperlink w:history="1" r:id="rIdajc69dgxxtodmfzoyxfrw">
+            <w:hyperlink w:history="1" r:id="rIdlghg0ytelu8zspvrky19v">
               <w:r>
                 <w:rPr>
                   <w:rFonts w:ascii="Arial" w:cs="Arial" w:eastAsia="Arial" w:hAnsi="Arial"/>
@@ -30269,7 +30971,7 @@
             <w:pPr>
               <w:spacing w:after="20" w:before="0"/>
             </w:pPr>
-            <w:hyperlink w:history="1" r:id="rIdyzo5bjvgzhgsbdgcsuwn-">
+            <w:hyperlink w:history="1" r:id="rIdeaneplzcfkq5qaq2t-d7h">
               <w:r>
                 <w:rPr>
                   <w:rFonts w:ascii="Arial" w:cs="Arial" w:eastAsia="Arial" w:hAnsi="Arial"/>
@@ -30302,7 +31004,7 @@
               <w:spacing w:after="10" w:before="0"/>
               <w:ind w:left="120"/>
             </w:pPr>
-            <w:hyperlink w:history="1" r:id="rIdajvlyq_m9ld44fbdxss8s">
+            <w:hyperlink w:history="1" r:id="rIdj3ncewwrwmmdznezsxp7a">
               <w:r>
                 <w:rPr>
                   <w:rFonts w:ascii="Arial" w:cs="Arial" w:eastAsia="Arial" w:hAnsi="Arial"/>
@@ -30497,7 +31199,7 @@
             <w:pPr>
               <w:spacing w:after="20" w:before="0"/>
             </w:pPr>
-            <w:hyperlink w:history="1" r:id="rIdkzhlg_vflkaxw6kzp9bkl">
+            <w:hyperlink w:history="1" r:id="rIdepmhvtiuwslsmtdvze3bq">
               <w:r>
                 <w:rPr>
                   <w:rFonts w:ascii="Arial" w:cs="Arial" w:eastAsia="Arial" w:hAnsi="Arial"/>
@@ -30530,7 +31232,7 @@
               <w:spacing w:after="10" w:before="0"/>
               <w:ind w:left="120"/>
             </w:pPr>
-            <w:hyperlink w:history="1" r:id="rIdxkmts5trwrky-n3sxr07w">
+            <w:hyperlink w:history="1" r:id="rId6r1-w1tntrq1oh9ilwbks">
               <w:r>
                 <w:rPr>
                   <w:rFonts w:ascii="Arial" w:cs="Arial" w:eastAsia="Arial" w:hAnsi="Arial"/>
@@ -30575,7 +31277,7 @@
             <w:pPr>
               <w:spacing w:after="20" w:before="0"/>
             </w:pPr>
-            <w:hyperlink w:history="1" r:id="rIdwlaikbfldgydo2_4yaf2x">
+            <w:hyperlink w:history="1" r:id="rId5bq96ssoz5hyyzosgn24e">
               <w:r>
                 <w:rPr>
                   <w:rFonts w:ascii="Arial" w:cs="Arial" w:eastAsia="Arial" w:hAnsi="Arial"/>
@@ -30608,7 +31310,7 @@
               <w:spacing w:after="10" w:before="0"/>
               <w:ind w:left="120"/>
             </w:pPr>
-            <w:hyperlink w:history="1" r:id="rIdi0karzh1gs_pmoeepeyvl">
+            <w:hyperlink w:history="1" r:id="rIdfqcmzvtgpbyqlx-fj_chq">
               <w:r>
                 <w:rPr>
                   <w:rFonts w:ascii="Arial" w:cs="Arial" w:eastAsia="Arial" w:hAnsi="Arial"/>
@@ -30803,7 +31505,7 @@
             <w:pPr>
               <w:spacing w:after="20" w:before="0"/>
             </w:pPr>
-            <w:hyperlink w:history="1" r:id="rIdilcux9wo4hyugnphvifni">
+            <w:hyperlink w:history="1" r:id="rIdkkokat3fwy1i9w0-3qitt">
               <w:r>
                 <w:rPr>
                   <w:rFonts w:ascii="Arial" w:cs="Arial" w:eastAsia="Arial" w:hAnsi="Arial"/>
@@ -30836,7 +31538,7 @@
               <w:spacing w:after="10" w:before="0"/>
               <w:ind w:left="120"/>
             </w:pPr>
-            <w:hyperlink w:history="1" r:id="rIdaz0mzwfhbp6aw_b450l3d">
+            <w:hyperlink w:history="1" r:id="rIdxmbl4sgbdrtni9psks9mq">
               <w:r>
                 <w:rPr>
                   <w:rFonts w:ascii="Arial" w:cs="Arial" w:eastAsia="Arial" w:hAnsi="Arial"/>
@@ -30881,7 +31583,7 @@
             <w:pPr>
               <w:spacing w:after="20" w:before="0"/>
             </w:pPr>
-            <w:hyperlink w:history="1" r:id="rIdubl5ic2rquit_jy99rzks">
+            <w:hyperlink w:history="1" r:id="rIdrafbdqxgkhiipc95zwaw2">
               <w:r>
                 <w:rPr>
                   <w:rFonts w:ascii="Arial" w:cs="Arial" w:eastAsia="Arial" w:hAnsi="Arial"/>
@@ -30914,7 +31616,7 @@
               <w:spacing w:after="10" w:before="0"/>
               <w:ind w:left="120"/>
             </w:pPr>
-            <w:hyperlink w:history="1" r:id="rIdupgprd4sylnogxphqhheu">
+            <w:hyperlink w:history="1" r:id="rIduconuvygyl1dkysnobwtk">
               <w:r>
                 <w:rPr>
                   <w:rFonts w:ascii="Arial" w:cs="Arial" w:eastAsia="Arial" w:hAnsi="Arial"/>
@@ -31410,6 +32112,65 @@
         </w:tc>
       </w:tr>
     </w:tbl>
+    <w:p>
+      <w:pPr>
+        <w:pBdr>
+          <w:top w:val="single" w:color="BBBBBB" w:sz="4" w:space="4"/>
+        </w:pBdr>
+        <w:spacing w:after="0" w:before="160"/>
+      </w:pPr>
+      <w:r>
+        <w:rPr>
+          <w:rFonts w:ascii="Arial" w:cs="Arial" w:eastAsia="Arial" w:hAnsi="Arial"/>
+          <w:color w:val="666666"/>
+          <w:sz w:val="14"/>
+          <w:szCs w:val="14"/>
+        </w:rPr>
+        <w:t xml:space="preserve">© 2026 SeaVuria and ARES. Aligned with KICD objectives. Developed by SeaVuria; technical implementation by ARES (with AI assistance from Claude). Licensed under </w:t>
+      </w:r>
+      <w:hyperlink w:history="1" r:id="rId7jznkp8pv0lm2euuekxjv">
+        <w:r>
+          <w:rPr>
+            <w:rFonts w:ascii="Arial" w:cs="Arial" w:eastAsia="Arial" w:hAnsi="Arial"/>
+            <w:color w:val="1F6B75"/>
+            <w:sz w:val="14"/>
+            <w:szCs w:val="14"/>
+            <w:u w:val="single" w:color="1F6B75"/>
+          </w:rPr>
+          <w:t xml:space="preserve">CC BY-NC 4.0</w:t>
+        </w:r>
+      </w:hyperlink>
+      <w:r>
+        <w:rPr>
+          <w:rFonts w:ascii="Arial" w:cs="Arial" w:eastAsia="Arial" w:hAnsi="Arial"/>
+          <w:color w:val="666666"/>
+          <w:sz w:val="14"/>
+          <w:szCs w:val="14"/>
+        </w:rPr>
+        <w:t xml:space="preserve"> (</w:t>
+      </w:r>
+      <w:hyperlink w:history="1" r:id="rIdaueeatd_blfpo1_epn-sq">
+        <w:r>
+          <w:rPr>
+            <w:rFonts w:ascii="Arial" w:cs="Arial" w:eastAsia="Arial" w:hAnsi="Arial"/>
+            <w:color w:val="1F6B75"/>
+            <w:sz w:val="14"/>
+            <w:szCs w:val="14"/>
+            <w:u w:val="single" w:color="1F6B75"/>
+          </w:rPr>
+          <w:t xml:space="preserve">https://creativecommons.org/licenses/by-nc/4.0/</w:t>
+        </w:r>
+      </w:hyperlink>
+      <w:r>
+        <w:rPr>
+          <w:rFonts w:ascii="Arial" w:cs="Arial" w:eastAsia="Arial" w:hAnsi="Arial"/>
+          <w:color w:val="666666"/>
+          <w:sz w:val="14"/>
+          <w:szCs w:val="14"/>
+        </w:rPr>
+        <w:t xml:space="preserve">).</w:t>
+      </w:r>
+    </w:p>
     <w:p>
       <w:r>
         <w:br w:type="page"/>

</xml_diff>